<commit_message>
Add Nordic market comparison (SE/NO/DK/FI), FX conversions and A. Nordic market tab
Co-Authored-By: Claude Opus 5.5 <noreply@anthropic.com>
Claude-Session: https://claude.ai/code/session_01Tu61bPEQej1E6sErbEFanY
</commit_message>
<xml_diff>
--- a/research/swedish_legal_market_size_summary.docx
+++ b/research/swedish_legal_market_size_summary.docx
@@ -15,7 +15,7 @@
           <w:sz w:val="40"/>
           <w:szCs w:val="40"/>
         </w:rPr>
-        <w:t xml:space="preserve">Swedish business-law market: size and data book guide</w:t>
+        <w:t xml:space="preserve">Swedish and Nordic business-law market: size and data book guide</w:t>
       </w:r>
     </w:p>
     <w:p>
@@ -31,7 +31,7 @@
           <w:sz w:val="20"/>
           <w:szCs w:val="20"/>
         </w:rPr>
-        <w:t xml:space="preserve">Summary of the market-size evidence and a guide to each tab of the legal market data book. Compiled October 2026. Amounts in SEK.</w:t>
+        <w:t xml:space="preserve">Summary of the market-size evidence for Sweden and the Nordics, and a guide to each tab of the legal market data book. Compiled October 2026. Amounts in SEK; other currencies converted at the Riksbank fixing of 12 Oct 2026 (USD 10.01, EUR 11.20, NOK 1.047, DKK 1.498 SEK).</w:t>
       </w:r>
     </w:p>
     <w:p>
@@ -77,10 +77,11 @@
         </w:tblBorders>
       </w:tblPr>
       <w:tblGrid>
-        <w:gridCol w:w="3300"/>
-        <w:gridCol w:w="2100"/>
-        <w:gridCol w:w="900"/>
-        <w:gridCol w:w="2726"/>
+        <w:gridCol w:w="2900"/>
+        <w:gridCol w:w="1800"/>
+        <w:gridCol w:w="1300"/>
+        <w:gridCol w:w="800"/>
+        <w:gridCol w:w="2226"/>
       </w:tblGrid>
       <w:tr>
         <w:trPr>
@@ -88,7 +89,7 @@
         </w:trPr>
         <w:tc>
           <w:tcPr>
-            <w:tcW w:type="dxa" w:w="3300"/>
+            <w:tcW w:type="dxa" w:w="2900"/>
             <w:tcBorders>
               <w:top w:val="single" w:color="BFBFBF" w:sz="4"/>
               <w:left w:val="single" w:color="BFBFBF" w:sz="4"/>
@@ -119,7 +120,7 @@
         </w:tc>
         <w:tc>
           <w:tcPr>
-            <w:tcW w:type="dxa" w:w="2100"/>
+            <w:tcW w:type="dxa" w:w="1800"/>
             <w:tcBorders>
               <w:top w:val="single" w:color="BFBFBF" w:sz="4"/>
               <w:left w:val="single" w:color="BFBFBF" w:sz="4"/>
@@ -144,13 +145,13 @@
                 <w:sz w:val="18"/>
                 <w:szCs w:val="18"/>
               </w:rPr>
-              <w:t xml:space="preserve">Figure</w:t>
-            </w:r>
-          </w:p>
-        </w:tc>
-        <w:tc>
-          <w:tcPr>
-            <w:tcW w:type="dxa" w:w="900"/>
+              <w:t xml:space="preserve">Figure (as reported)</w:t>
+            </w:r>
+          </w:p>
+        </w:tc>
+        <w:tc>
+          <w:tcPr>
+            <w:tcW w:type="dxa" w:w="1300"/>
             <w:tcBorders>
               <w:top w:val="single" w:color="BFBFBF" w:sz="4"/>
               <w:left w:val="single" w:color="BFBFBF" w:sz="4"/>
@@ -175,13 +176,13 @@
                 <w:sz w:val="18"/>
                 <w:szCs w:val="18"/>
               </w:rPr>
-              <w:t xml:space="preserve">Year</w:t>
-            </w:r>
-          </w:p>
-        </w:tc>
-        <w:tc>
-          <w:tcPr>
-            <w:tcW w:type="dxa" w:w="2726"/>
+              <w:t xml:space="preserve">SEK equivalent</w:t>
+            </w:r>
+          </w:p>
+        </w:tc>
+        <w:tc>
+          <w:tcPr>
+            <w:tcW w:type="dxa" w:w="800"/>
             <w:tcBorders>
               <w:top w:val="single" w:color="BFBFBF" w:sz="4"/>
               <w:left w:val="single" w:color="BFBFBF" w:sz="4"/>
@@ -206,6 +207,37 @@
                 <w:sz w:val="18"/>
                 <w:szCs w:val="18"/>
               </w:rPr>
+              <w:t xml:space="preserve">Year</w:t>
+            </w:r>
+          </w:p>
+        </w:tc>
+        <w:tc>
+          <w:tcPr>
+            <w:tcW w:type="dxa" w:w="2226"/>
+            <w:tcBorders>
+              <w:top w:val="single" w:color="BFBFBF" w:sz="4"/>
+              <w:left w:val="single" w:color="BFBFBF" w:sz="4"/>
+              <w:bottom w:val="single" w:color="BFBFBF" w:sz="4"/>
+              <w:right w:val="single" w:color="BFBFBF" w:sz="4"/>
+            </w:tcBorders>
+            <w:shd w:fill="1F3864" w:color="auto" w:val="clear"/>
+            <w:tcMar>
+              <w:top w:type="dxa" w:w="60"/>
+              <w:left w:type="dxa" w:w="100"/>
+              <w:bottom w:type="dxa" w:w="60"/>
+              <w:right w:type="dxa" w:w="100"/>
+            </w:tcMar>
+          </w:tcPr>
+          <w:p>
+            <w:r>
+              <w:rPr>
+                <w:rFonts w:ascii="Calibri" w:cs="Calibri" w:eastAsia="Calibri" w:hAnsi="Calibri"/>
+                <w:b/>
+                <w:bCs/>
+                <w:color w:val="FFFFFF"/>
+                <w:sz w:val="18"/>
+                <w:szCs w:val="18"/>
+              </w:rPr>
               <w:t xml:space="preserve">Comment</w:t>
             </w:r>
           </w:p>
@@ -214,7 +246,7 @@
       <w:tr>
         <w:tc>
           <w:tcPr>
-            <w:tcW w:type="dxa" w:w="3300"/>
+            <w:tcW w:type="dxa" w:w="2900"/>
             <w:tcBorders>
               <w:top w:val="single" w:color="BFBFBF" w:sz="4"/>
               <w:left w:val="single" w:color="BFBFBF" w:sz="4"/>
@@ -244,7 +276,7 @@
         </w:tc>
         <w:tc>
           <w:tcPr>
-            <w:tcW w:type="dxa" w:w="2100"/>
+            <w:tcW w:type="dxa" w:w="1800"/>
             <w:tcBorders>
               <w:top w:val="single" w:color="BFBFBF" w:sz="4"/>
               <w:left w:val="single" w:color="BFBFBF" w:sz="4"/>
@@ -274,7 +306,37 @@
         </w:tc>
         <w:tc>
           <w:tcPr>
-            <w:tcW w:type="dxa" w:w="900"/>
+            <w:tcW w:type="dxa" w:w="1300"/>
+            <w:tcBorders>
+              <w:top w:val="single" w:color="BFBFBF" w:sz="4"/>
+              <w:left w:val="single" w:color="BFBFBF" w:sz="4"/>
+              <w:bottom w:val="single" w:color="BFBFBF" w:sz="4"/>
+              <w:right w:val="single" w:color="BFBFBF" w:sz="4"/>
+            </w:tcBorders>
+            <w:tcMar>
+              <w:top w:type="dxa" w:w="60"/>
+              <w:left w:type="dxa" w:w="100"/>
+              <w:bottom w:type="dxa" w:w="60"/>
+              <w:right w:type="dxa" w:w="100"/>
+            </w:tcMar>
+          </w:tcPr>
+          <w:p>
+            <w:r>
+              <w:rPr>
+                <w:rFonts w:ascii="Calibri" w:cs="Calibri" w:eastAsia="Calibri" w:hAnsi="Calibri"/>
+                <w:b w:val="false"/>
+                <w:bCs w:val="false"/>
+                <w:color w:val="000000"/>
+                <w:sz w:val="18"/>
+                <w:szCs w:val="18"/>
+              </w:rPr>
+              <w:t xml:space="preserve">SEK 16bn</w:t>
+            </w:r>
+          </w:p>
+        </w:tc>
+        <w:tc>
+          <w:tcPr>
+            <w:tcW w:type="dxa" w:w="800"/>
             <w:tcBorders>
               <w:top w:val="single" w:color="BFBFBF" w:sz="4"/>
               <w:left w:val="single" w:color="BFBFBF" w:sz="4"/>
@@ -304,7 +366,7 @@
         </w:tc>
         <w:tc>
           <w:tcPr>
-            <w:tcW w:type="dxa" w:w="2726"/>
+            <w:tcW w:type="dxa" w:w="2226"/>
             <w:tcBorders>
               <w:top w:val="single" w:color="BFBFBF" w:sz="4"/>
               <w:left w:val="single" w:color="BFBFBF" w:sz="4"/>
@@ -336,7 +398,7 @@
       <w:tr>
         <w:tc>
           <w:tcPr>
-            <w:tcW w:type="dxa" w:w="3300"/>
+            <w:tcW w:type="dxa" w:w="2900"/>
             <w:tcBorders>
               <w:top w:val="single" w:color="BFBFBF" w:sz="4"/>
               <w:left w:val="single" w:color="BFBFBF" w:sz="4"/>
@@ -366,7 +428,7 @@
         </w:tc>
         <w:tc>
           <w:tcPr>
-            <w:tcW w:type="dxa" w:w="2100"/>
+            <w:tcW w:type="dxa" w:w="1800"/>
             <w:tcBorders>
               <w:top w:val="single" w:color="BFBFBF" w:sz="4"/>
               <w:left w:val="single" w:color="BFBFBF" w:sz="4"/>
@@ -396,7 +458,37 @@
         </w:tc>
         <w:tc>
           <w:tcPr>
-            <w:tcW w:type="dxa" w:w="900"/>
+            <w:tcW w:type="dxa" w:w="1300"/>
+            <w:tcBorders>
+              <w:top w:val="single" w:color="BFBFBF" w:sz="4"/>
+              <w:left w:val="single" w:color="BFBFBF" w:sz="4"/>
+              <w:bottom w:val="single" w:color="BFBFBF" w:sz="4"/>
+              <w:right w:val="single" w:color="BFBFBF" w:sz="4"/>
+            </w:tcBorders>
+            <w:tcMar>
+              <w:top w:type="dxa" w:w="60"/>
+              <w:left w:type="dxa" w:w="100"/>
+              <w:bottom w:type="dxa" w:w="60"/>
+              <w:right w:type="dxa" w:w="100"/>
+            </w:tcMar>
+          </w:tcPr>
+          <w:p>
+            <w:r>
+              <w:rPr>
+                <w:rFonts w:ascii="Calibri" w:cs="Calibri" w:eastAsia="Calibri" w:hAnsi="Calibri"/>
+                <w:b w:val="false"/>
+                <w:bCs w:val="false"/>
+                <w:color w:val="000000"/>
+                <w:sz w:val="18"/>
+                <w:szCs w:val="18"/>
+              </w:rPr>
+              <w:t xml:space="preserve">SEK 15.4bn</w:t>
+            </w:r>
+          </w:p>
+        </w:tc>
+        <w:tc>
+          <w:tcPr>
+            <w:tcW w:type="dxa" w:w="800"/>
             <w:tcBorders>
               <w:top w:val="single" w:color="BFBFBF" w:sz="4"/>
               <w:left w:val="single" w:color="BFBFBF" w:sz="4"/>
@@ -426,7 +518,7 @@
         </w:tc>
         <w:tc>
           <w:tcPr>
-            <w:tcW w:type="dxa" w:w="2726"/>
+            <w:tcW w:type="dxa" w:w="2226"/>
             <w:tcBorders>
               <w:top w:val="single" w:color="BFBFBF" w:sz="4"/>
               <w:left w:val="single" w:color="BFBFBF" w:sz="4"/>
@@ -458,7 +550,7 @@
       <w:tr>
         <w:tc>
           <w:tcPr>
-            <w:tcW w:type="dxa" w:w="3300"/>
+            <w:tcW w:type="dxa" w:w="2900"/>
             <w:tcBorders>
               <w:top w:val="single" w:color="BFBFBF" w:sz="4"/>
               <w:left w:val="single" w:color="BFBFBF" w:sz="4"/>
@@ -488,7 +580,7 @@
         </w:tc>
         <w:tc>
           <w:tcPr>
-            <w:tcW w:type="dxa" w:w="2100"/>
+            <w:tcW w:type="dxa" w:w="1800"/>
             <w:tcBorders>
               <w:top w:val="single" w:color="BFBFBF" w:sz="4"/>
               <w:left w:val="single" w:color="BFBFBF" w:sz="4"/>
@@ -518,7 +610,37 @@
         </w:tc>
         <w:tc>
           <w:tcPr>
-            <w:tcW w:type="dxa" w:w="900"/>
+            <w:tcW w:type="dxa" w:w="1300"/>
+            <w:tcBorders>
+              <w:top w:val="single" w:color="BFBFBF" w:sz="4"/>
+              <w:left w:val="single" w:color="BFBFBF" w:sz="4"/>
+              <w:bottom w:val="single" w:color="BFBFBF" w:sz="4"/>
+              <w:right w:val="single" w:color="BFBFBF" w:sz="4"/>
+            </w:tcBorders>
+            <w:tcMar>
+              <w:top w:type="dxa" w:w="60"/>
+              <w:left w:type="dxa" w:w="100"/>
+              <w:bottom w:type="dxa" w:w="60"/>
+              <w:right w:type="dxa" w:w="100"/>
+            </w:tcMar>
+          </w:tcPr>
+          <w:p>
+            <w:r>
+              <w:rPr>
+                <w:rFonts w:ascii="Calibri" w:cs="Calibri" w:eastAsia="Calibri" w:hAnsi="Calibri"/>
+                <w:b w:val="false"/>
+                <w:bCs w:val="false"/>
+                <w:color w:val="000000"/>
+                <w:sz w:val="18"/>
+                <w:szCs w:val="18"/>
+              </w:rPr>
+              <w:t xml:space="preserve">&gt;SEK 25bn</w:t>
+            </w:r>
+          </w:p>
+        </w:tc>
+        <w:tc>
+          <w:tcPr>
+            <w:tcW w:type="dxa" w:w="800"/>
             <w:tcBorders>
               <w:top w:val="single" w:color="BFBFBF" w:sz="4"/>
               <w:left w:val="single" w:color="BFBFBF" w:sz="4"/>
@@ -548,7 +670,7 @@
         </w:tc>
         <w:tc>
           <w:tcPr>
-            <w:tcW w:type="dxa" w:w="2726"/>
+            <w:tcW w:type="dxa" w:w="2226"/>
             <w:tcBorders>
               <w:top w:val="single" w:color="BFBFBF" w:sz="4"/>
               <w:left w:val="single" w:color="BFBFBF" w:sz="4"/>
@@ -580,7 +702,7 @@
       <w:tr>
         <w:tc>
           <w:tcPr>
-            <w:tcW w:type="dxa" w:w="3300"/>
+            <w:tcW w:type="dxa" w:w="2900"/>
             <w:tcBorders>
               <w:top w:val="single" w:color="BFBFBF" w:sz="4"/>
               <w:left w:val="single" w:color="BFBFBF" w:sz="4"/>
@@ -610,7 +732,7 @@
         </w:tc>
         <w:tc>
           <w:tcPr>
-            <w:tcW w:type="dxa" w:w="2100"/>
+            <w:tcW w:type="dxa" w:w="1800"/>
             <w:tcBorders>
               <w:top w:val="single" w:color="BFBFBF" w:sz="4"/>
               <w:left w:val="single" w:color="BFBFBF" w:sz="4"/>
@@ -640,7 +762,37 @@
         </w:tc>
         <w:tc>
           <w:tcPr>
-            <w:tcW w:type="dxa" w:w="900"/>
+            <w:tcW w:type="dxa" w:w="1300"/>
+            <w:tcBorders>
+              <w:top w:val="single" w:color="BFBFBF" w:sz="4"/>
+              <w:left w:val="single" w:color="BFBFBF" w:sz="4"/>
+              <w:bottom w:val="single" w:color="BFBFBF" w:sz="4"/>
+              <w:right w:val="single" w:color="BFBFBF" w:sz="4"/>
+            </w:tcBorders>
+            <w:tcMar>
+              <w:top w:type="dxa" w:w="60"/>
+              <w:left w:type="dxa" w:w="100"/>
+              <w:bottom w:type="dxa" w:w="60"/>
+              <w:right w:type="dxa" w:w="100"/>
+            </w:tcMar>
+          </w:tcPr>
+          <w:p>
+            <w:r>
+              <w:rPr>
+                <w:rFonts w:ascii="Calibri" w:cs="Calibri" w:eastAsia="Calibri" w:hAnsi="Calibri"/>
+                <w:b w:val="false"/>
+                <w:bCs w:val="false"/>
+                <w:color w:val="000000"/>
+                <w:sz w:val="18"/>
+                <w:szCs w:val="18"/>
+              </w:rPr>
+              <w:t xml:space="preserve">SEK 29bn</w:t>
+            </w:r>
+          </w:p>
+        </w:tc>
+        <w:tc>
+          <w:tcPr>
+            <w:tcW w:type="dxa" w:w="800"/>
             <w:tcBorders>
               <w:top w:val="single" w:color="BFBFBF" w:sz="4"/>
               <w:left w:val="single" w:color="BFBFBF" w:sz="4"/>
@@ -670,7 +822,7 @@
         </w:tc>
         <w:tc>
           <w:tcPr>
-            <w:tcW w:type="dxa" w:w="2726"/>
+            <w:tcW w:type="dxa" w:w="2226"/>
             <w:tcBorders>
               <w:top w:val="single" w:color="BFBFBF" w:sz="4"/>
               <w:left w:val="single" w:color="BFBFBF" w:sz="4"/>
@@ -702,7 +854,7 @@
       <w:tr>
         <w:tc>
           <w:tcPr>
-            <w:tcW w:type="dxa" w:w="3300"/>
+            <w:tcW w:type="dxa" w:w="2900"/>
             <w:tcBorders>
               <w:top w:val="single" w:color="BFBFBF" w:sz="4"/>
               <w:left w:val="single" w:color="BFBFBF" w:sz="4"/>
@@ -732,7 +884,7 @@
         </w:tc>
         <w:tc>
           <w:tcPr>
-            <w:tcW w:type="dxa" w:w="2100"/>
+            <w:tcW w:type="dxa" w:w="1800"/>
             <w:tcBorders>
               <w:top w:val="single" w:color="BFBFBF" w:sz="4"/>
               <w:left w:val="single" w:color="BFBFBF" w:sz="4"/>
@@ -762,7 +914,37 @@
         </w:tc>
         <w:tc>
           <w:tcPr>
-            <w:tcW w:type="dxa" w:w="900"/>
+            <w:tcW w:type="dxa" w:w="1300"/>
+            <w:tcBorders>
+              <w:top w:val="single" w:color="BFBFBF" w:sz="4"/>
+              <w:left w:val="single" w:color="BFBFBF" w:sz="4"/>
+              <w:bottom w:val="single" w:color="BFBFBF" w:sz="4"/>
+              <w:right w:val="single" w:color="BFBFBF" w:sz="4"/>
+            </w:tcBorders>
+            <w:tcMar>
+              <w:top w:type="dxa" w:w="60"/>
+              <w:left w:type="dxa" w:w="100"/>
+              <w:bottom w:type="dxa" w:w="60"/>
+              <w:right w:type="dxa" w:w="100"/>
+            </w:tcMar>
+          </w:tcPr>
+          <w:p>
+            <w:r>
+              <w:rPr>
+                <w:rFonts w:ascii="Calibri" w:cs="Calibri" w:eastAsia="Calibri" w:hAnsi="Calibri"/>
+                <w:b w:val="false"/>
+                <w:bCs w:val="false"/>
+                <w:color w:val="000000"/>
+                <w:sz w:val="18"/>
+                <w:szCs w:val="18"/>
+              </w:rPr>
+              <w:t xml:space="preserve">SEK 38.9bn</w:t>
+            </w:r>
+          </w:p>
+        </w:tc>
+        <w:tc>
+          <w:tcPr>
+            <w:tcW w:type="dxa" w:w="800"/>
             <w:tcBorders>
               <w:top w:val="single" w:color="BFBFBF" w:sz="4"/>
               <w:left w:val="single" w:color="BFBFBF" w:sz="4"/>
@@ -792,7 +974,7 @@
         </w:tc>
         <w:tc>
           <w:tcPr>
-            <w:tcW w:type="dxa" w:w="2726"/>
+            <w:tcW w:type="dxa" w:w="2226"/>
             <w:tcBorders>
               <w:top w:val="single" w:color="BFBFBF" w:sz="4"/>
               <w:left w:val="single" w:color="BFBFBF" w:sz="4"/>
@@ -824,7 +1006,7 @@
       <w:tr>
         <w:tc>
           <w:tcPr>
-            <w:tcW w:type="dxa" w:w="3300"/>
+            <w:tcW w:type="dxa" w:w="2900"/>
             <w:tcBorders>
               <w:top w:val="single" w:color="BFBFBF" w:sz="4"/>
               <w:left w:val="single" w:color="BFBFBF" w:sz="4"/>
@@ -854,7 +1036,7 @@
         </w:tc>
         <w:tc>
           <w:tcPr>
-            <w:tcW w:type="dxa" w:w="2100"/>
+            <w:tcW w:type="dxa" w:w="1800"/>
             <w:tcBorders>
               <w:top w:val="single" w:color="BFBFBF" w:sz="4"/>
               <w:left w:val="single" w:color="BFBFBF" w:sz="4"/>
@@ -884,7 +1066,37 @@
         </w:tc>
         <w:tc>
           <w:tcPr>
-            <w:tcW w:type="dxa" w:w="900"/>
+            <w:tcW w:type="dxa" w:w="1300"/>
+            <w:tcBorders>
+              <w:top w:val="single" w:color="BFBFBF" w:sz="4"/>
+              <w:left w:val="single" w:color="BFBFBF" w:sz="4"/>
+              <w:bottom w:val="single" w:color="BFBFBF" w:sz="4"/>
+              <w:right w:val="single" w:color="BFBFBF" w:sz="4"/>
+            </w:tcBorders>
+            <w:tcMar>
+              <w:top w:type="dxa" w:w="60"/>
+              <w:left w:type="dxa" w:w="100"/>
+              <w:bottom w:type="dxa" w:w="60"/>
+              <w:right w:type="dxa" w:w="100"/>
+            </w:tcMar>
+          </w:tcPr>
+          <w:p>
+            <w:r>
+              <w:rPr>
+                <w:rFonts w:ascii="Calibri" w:cs="Calibri" w:eastAsia="Calibri" w:hAnsi="Calibri"/>
+                <w:b w:val="false"/>
+                <w:bCs w:val="false"/>
+                <w:color w:val="000000"/>
+                <w:sz w:val="18"/>
+                <w:szCs w:val="18"/>
+              </w:rPr>
+              <w:t xml:space="preserve">SEK 31.0bn</w:t>
+            </w:r>
+          </w:p>
+        </w:tc>
+        <w:tc>
+          <w:tcPr>
+            <w:tcW w:type="dxa" w:w="800"/>
             <w:tcBorders>
               <w:top w:val="single" w:color="BFBFBF" w:sz="4"/>
               <w:left w:val="single" w:color="BFBFBF" w:sz="4"/>
@@ -914,7 +1126,7 @@
         </w:tc>
         <w:tc>
           <w:tcPr>
-            <w:tcW w:type="dxa" w:w="2726"/>
+            <w:tcW w:type="dxa" w:w="2226"/>
             <w:tcBorders>
               <w:top w:val="single" w:color="BFBFBF" w:sz="4"/>
               <w:left w:val="single" w:color="BFBFBF" w:sz="4"/>
@@ -946,7 +1158,7 @@
       <w:tr>
         <w:tc>
           <w:tcPr>
-            <w:tcW w:type="dxa" w:w="3300"/>
+            <w:tcW w:type="dxa" w:w="2900"/>
             <w:tcBorders>
               <w:top w:val="single" w:color="BFBFBF" w:sz="4"/>
               <w:left w:val="single" w:color="BFBFBF" w:sz="4"/>
@@ -976,7 +1188,7 @@
         </w:tc>
         <w:tc>
           <w:tcPr>
-            <w:tcW w:type="dxa" w:w="2100"/>
+            <w:tcW w:type="dxa" w:w="1800"/>
             <w:tcBorders>
               <w:top w:val="single" w:color="BFBFBF" w:sz="4"/>
               <w:left w:val="single" w:color="BFBFBF" w:sz="4"/>
@@ -1006,7 +1218,37 @@
         </w:tc>
         <w:tc>
           <w:tcPr>
-            <w:tcW w:type="dxa" w:w="900"/>
+            <w:tcW w:type="dxa" w:w="1300"/>
+            <w:tcBorders>
+              <w:top w:val="single" w:color="BFBFBF" w:sz="4"/>
+              <w:left w:val="single" w:color="BFBFBF" w:sz="4"/>
+              <w:bottom w:val="single" w:color="BFBFBF" w:sz="4"/>
+              <w:right w:val="single" w:color="BFBFBF" w:sz="4"/>
+            </w:tcBorders>
+            <w:tcMar>
+              <w:top w:type="dxa" w:w="60"/>
+              <w:left w:type="dxa" w:w="100"/>
+              <w:bottom w:type="dxa" w:w="60"/>
+              <w:right w:type="dxa" w:w="100"/>
+            </w:tcMar>
+          </w:tcPr>
+          <w:p>
+            <w:r>
+              <w:rPr>
+                <w:rFonts w:ascii="Calibri" w:cs="Calibri" w:eastAsia="Calibri" w:hAnsi="Calibri"/>
+                <w:b w:val="false"/>
+                <w:bCs w:val="false"/>
+                <w:color w:val="000000"/>
+                <w:sz w:val="18"/>
+                <w:szCs w:val="18"/>
+              </w:rPr>
+              <w:t xml:space="preserve">SEK 39.2bn</w:t>
+            </w:r>
+          </w:p>
+        </w:tc>
+        <w:tc>
+          <w:tcPr>
+            <w:tcW w:type="dxa" w:w="800"/>
             <w:tcBorders>
               <w:top w:val="single" w:color="BFBFBF" w:sz="4"/>
               <w:left w:val="single" w:color="BFBFBF" w:sz="4"/>
@@ -1036,7 +1278,7 @@
         </w:tc>
         <w:tc>
           <w:tcPr>
-            <w:tcW w:type="dxa" w:w="2726"/>
+            <w:tcW w:type="dxa" w:w="2226"/>
             <w:tcBorders>
               <w:top w:val="single" w:color="BFBFBF" w:sz="4"/>
               <w:left w:val="single" w:color="BFBFBF" w:sz="4"/>
@@ -2522,7 +2764,1885 @@
           <w:sz w:val="28"/>
           <w:szCs w:val="28"/>
         </w:rPr>
-        <w:t xml:space="preserve">2. Guide to the data book</w:t>
+        <w:t xml:space="preserve">2. Nordic comparison: Sweden, Norway, Denmark, Finland</w:t>
+      </w:r>
+    </w:p>
+    <w:p>
+      <w:pPr>
+        <w:spacing w:after="120"/>
+      </w:pPr>
+      <w:r>
+        <w:rPr>
+          <w:rFonts w:ascii="Calibri" w:cs="Calibri" w:eastAsia="Calibri" w:hAnsi="Calibri"/>
+          <w:sz w:val="21"/>
+          <w:szCs w:val="21"/>
+        </w:rPr>
+        <w:t xml:space="preserve">Official statistics cover all legal activities; only Norway publishes a business-law split. Business-law figures for Sweden, Denmark and Finland are estimates. SEK at the Riksbank fixing of 12 Oct 2026.</w:t>
+      </w:r>
+    </w:p>
+    <w:tbl>
+      <w:tblPr>
+        <w:tblW w:type="dxa" w:w="9026"/>
+        <w:tblBorders>
+          <w:top w:val="single" w:color="auto" w:sz="4"/>
+          <w:left w:val="single" w:color="auto" w:sz="4"/>
+          <w:bottom w:val="single" w:color="auto" w:sz="4"/>
+          <w:right w:val="single" w:color="auto" w:sz="4"/>
+          <w:insideH w:val="single" w:color="auto" w:sz="4"/>
+          <w:insideV w:val="single" w:color="auto" w:sz="4"/>
+        </w:tblBorders>
+      </w:tblPr>
+      <w:tblGrid>
+        <w:gridCol w:w="2000"/>
+        <w:gridCol w:w="1750"/>
+        <w:gridCol w:w="1750"/>
+        <w:gridCol w:w="1750"/>
+        <w:gridCol w:w="1776"/>
+      </w:tblGrid>
+      <w:tr>
+        <w:trPr>
+          <w:tblHeader/>
+        </w:trPr>
+        <w:tc>
+          <w:tcPr>
+            <w:tcW w:type="dxa" w:w="2000"/>
+            <w:tcBorders>
+              <w:top w:val="single" w:color="BFBFBF" w:sz="4"/>
+              <w:left w:val="single" w:color="BFBFBF" w:sz="4"/>
+              <w:bottom w:val="single" w:color="BFBFBF" w:sz="4"/>
+              <w:right w:val="single" w:color="BFBFBF" w:sz="4"/>
+            </w:tcBorders>
+            <w:shd w:fill="1F3864" w:color="auto" w:val="clear"/>
+            <w:tcMar>
+              <w:top w:type="dxa" w:w="60"/>
+              <w:left w:type="dxa" w:w="100"/>
+              <w:bottom w:type="dxa" w:w="60"/>
+              <w:right w:type="dxa" w:w="100"/>
+            </w:tcMar>
+          </w:tcPr>
+          <w:p>
+            <w:r>
+              <w:rPr>
+                <w:rFonts w:ascii="Calibri" w:cs="Calibri" w:eastAsia="Calibri" w:hAnsi="Calibri"/>
+                <w:b/>
+                <w:bCs/>
+                <w:color w:val="FFFFFF"/>
+                <w:sz w:val="18"/>
+                <w:szCs w:val="18"/>
+              </w:rPr>
+              <w:t xml:space="preserve"/>
+            </w:r>
+          </w:p>
+        </w:tc>
+        <w:tc>
+          <w:tcPr>
+            <w:tcW w:type="dxa" w:w="1750"/>
+            <w:tcBorders>
+              <w:top w:val="single" w:color="BFBFBF" w:sz="4"/>
+              <w:left w:val="single" w:color="BFBFBF" w:sz="4"/>
+              <w:bottom w:val="single" w:color="BFBFBF" w:sz="4"/>
+              <w:right w:val="single" w:color="BFBFBF" w:sz="4"/>
+            </w:tcBorders>
+            <w:shd w:fill="1F3864" w:color="auto" w:val="clear"/>
+            <w:tcMar>
+              <w:top w:type="dxa" w:w="60"/>
+              <w:left w:type="dxa" w:w="100"/>
+              <w:bottom w:type="dxa" w:w="60"/>
+              <w:right w:type="dxa" w:w="100"/>
+            </w:tcMar>
+          </w:tcPr>
+          <w:p>
+            <w:r>
+              <w:rPr>
+                <w:rFonts w:ascii="Calibri" w:cs="Calibri" w:eastAsia="Calibri" w:hAnsi="Calibri"/>
+                <w:b/>
+                <w:bCs/>
+                <w:color w:val="FFFFFF"/>
+                <w:sz w:val="18"/>
+                <w:szCs w:val="18"/>
+              </w:rPr>
+              <w:t xml:space="preserve">Sweden</w:t>
+            </w:r>
+          </w:p>
+        </w:tc>
+        <w:tc>
+          <w:tcPr>
+            <w:tcW w:type="dxa" w:w="1750"/>
+            <w:tcBorders>
+              <w:top w:val="single" w:color="BFBFBF" w:sz="4"/>
+              <w:left w:val="single" w:color="BFBFBF" w:sz="4"/>
+              <w:bottom w:val="single" w:color="BFBFBF" w:sz="4"/>
+              <w:right w:val="single" w:color="BFBFBF" w:sz="4"/>
+            </w:tcBorders>
+            <w:shd w:fill="1F3864" w:color="auto" w:val="clear"/>
+            <w:tcMar>
+              <w:top w:type="dxa" w:w="60"/>
+              <w:left w:type="dxa" w:w="100"/>
+              <w:bottom w:type="dxa" w:w="60"/>
+              <w:right w:type="dxa" w:w="100"/>
+            </w:tcMar>
+          </w:tcPr>
+          <w:p>
+            <w:r>
+              <w:rPr>
+                <w:rFonts w:ascii="Calibri" w:cs="Calibri" w:eastAsia="Calibri" w:hAnsi="Calibri"/>
+                <w:b/>
+                <w:bCs/>
+                <w:color w:val="FFFFFF"/>
+                <w:sz w:val="18"/>
+                <w:szCs w:val="18"/>
+              </w:rPr>
+              <w:t xml:space="preserve">Norway</w:t>
+            </w:r>
+          </w:p>
+        </w:tc>
+        <w:tc>
+          <w:tcPr>
+            <w:tcW w:type="dxa" w:w="1750"/>
+            <w:tcBorders>
+              <w:top w:val="single" w:color="BFBFBF" w:sz="4"/>
+              <w:left w:val="single" w:color="BFBFBF" w:sz="4"/>
+              <w:bottom w:val="single" w:color="BFBFBF" w:sz="4"/>
+              <w:right w:val="single" w:color="BFBFBF" w:sz="4"/>
+            </w:tcBorders>
+            <w:shd w:fill="1F3864" w:color="auto" w:val="clear"/>
+            <w:tcMar>
+              <w:top w:type="dxa" w:w="60"/>
+              <w:left w:type="dxa" w:w="100"/>
+              <w:bottom w:type="dxa" w:w="60"/>
+              <w:right w:type="dxa" w:w="100"/>
+            </w:tcMar>
+          </w:tcPr>
+          <w:p>
+            <w:r>
+              <w:rPr>
+                <w:rFonts w:ascii="Calibri" w:cs="Calibri" w:eastAsia="Calibri" w:hAnsi="Calibri"/>
+                <w:b/>
+                <w:bCs/>
+                <w:color w:val="FFFFFF"/>
+                <w:sz w:val="18"/>
+                <w:szCs w:val="18"/>
+              </w:rPr>
+              <w:t xml:space="preserve">Denmark</w:t>
+            </w:r>
+          </w:p>
+        </w:tc>
+        <w:tc>
+          <w:tcPr>
+            <w:tcW w:type="dxa" w:w="1776"/>
+            <w:tcBorders>
+              <w:top w:val="single" w:color="BFBFBF" w:sz="4"/>
+              <w:left w:val="single" w:color="BFBFBF" w:sz="4"/>
+              <w:bottom w:val="single" w:color="BFBFBF" w:sz="4"/>
+              <w:right w:val="single" w:color="BFBFBF" w:sz="4"/>
+            </w:tcBorders>
+            <w:shd w:fill="1F3864" w:color="auto" w:val="clear"/>
+            <w:tcMar>
+              <w:top w:type="dxa" w:w="60"/>
+              <w:left w:type="dxa" w:w="100"/>
+              <w:bottom w:type="dxa" w:w="60"/>
+              <w:right w:type="dxa" w:w="100"/>
+            </w:tcMar>
+          </w:tcPr>
+          <w:p>
+            <w:r>
+              <w:rPr>
+                <w:rFonts w:ascii="Calibri" w:cs="Calibri" w:eastAsia="Calibri" w:hAnsi="Calibri"/>
+                <w:b/>
+                <w:bCs/>
+                <w:color w:val="FFFFFF"/>
+                <w:sz w:val="18"/>
+                <w:szCs w:val="18"/>
+              </w:rPr>
+              <w:t xml:space="preserve">Finland</w:t>
+            </w:r>
+          </w:p>
+        </w:tc>
+      </w:tr>
+      <w:tr>
+        <w:tc>
+          <w:tcPr>
+            <w:tcW w:type="dxa" w:w="2000"/>
+            <w:tcBorders>
+              <w:top w:val="single" w:color="BFBFBF" w:sz="4"/>
+              <w:left w:val="single" w:color="BFBFBF" w:sz="4"/>
+              <w:bottom w:val="single" w:color="BFBFBF" w:sz="4"/>
+              <w:right w:val="single" w:color="BFBFBF" w:sz="4"/>
+            </w:tcBorders>
+            <w:tcMar>
+              <w:top w:type="dxa" w:w="60"/>
+              <w:left w:type="dxa" w:w="100"/>
+              <w:bottom w:type="dxa" w:w="60"/>
+              <w:right w:type="dxa" w:w="100"/>
+            </w:tcMar>
+          </w:tcPr>
+          <w:p>
+            <w:r>
+              <w:rPr>
+                <w:rFonts w:ascii="Calibri" w:cs="Calibri" w:eastAsia="Calibri" w:hAnsi="Calibri"/>
+                <w:b w:val="false"/>
+                <w:bCs w:val="false"/>
+                <w:color w:val="000000"/>
+                <w:sz w:val="18"/>
+                <w:szCs w:val="18"/>
+              </w:rPr>
+              <w:t xml:space="preserve">Legal activities, official (2024)</w:t>
+            </w:r>
+          </w:p>
+        </w:tc>
+        <w:tc>
+          <w:tcPr>
+            <w:tcW w:type="dxa" w:w="1750"/>
+            <w:tcBorders>
+              <w:top w:val="single" w:color="BFBFBF" w:sz="4"/>
+              <w:left w:val="single" w:color="BFBFBF" w:sz="4"/>
+              <w:bottom w:val="single" w:color="BFBFBF" w:sz="4"/>
+              <w:right w:val="single" w:color="BFBFBF" w:sz="4"/>
+            </w:tcBorders>
+            <w:tcMar>
+              <w:top w:type="dxa" w:w="60"/>
+              <w:left w:type="dxa" w:w="100"/>
+              <w:bottom w:type="dxa" w:w="60"/>
+              <w:right w:type="dxa" w:w="100"/>
+            </w:tcMar>
+          </w:tcPr>
+          <w:p>
+            <w:r>
+              <w:rPr>
+                <w:rFonts w:ascii="Calibri" w:cs="Calibri" w:eastAsia="Calibri" w:hAnsi="Calibri"/>
+                <w:b w:val="false"/>
+                <w:bCs w:val="false"/>
+                <w:color w:val="000000"/>
+                <w:sz w:val="18"/>
+                <w:szCs w:val="18"/>
+              </w:rPr>
+              <w:t xml:space="preserve">SEK 38.9bn</w:t>
+            </w:r>
+          </w:p>
+        </w:tc>
+        <w:tc>
+          <w:tcPr>
+            <w:tcW w:type="dxa" w:w="1750"/>
+            <w:tcBorders>
+              <w:top w:val="single" w:color="BFBFBF" w:sz="4"/>
+              <w:left w:val="single" w:color="BFBFBF" w:sz="4"/>
+              <w:bottom w:val="single" w:color="BFBFBF" w:sz="4"/>
+              <w:right w:val="single" w:color="BFBFBF" w:sz="4"/>
+            </w:tcBorders>
+            <w:tcMar>
+              <w:top w:type="dxa" w:w="60"/>
+              <w:left w:type="dxa" w:w="100"/>
+              <w:bottom w:type="dxa" w:w="60"/>
+              <w:right w:type="dxa" w:w="100"/>
+            </w:tcMar>
+          </w:tcPr>
+          <w:p>
+            <w:r>
+              <w:rPr>
+                <w:rFonts w:ascii="Calibri" w:cs="Calibri" w:eastAsia="Calibri" w:hAnsi="Calibri"/>
+                <w:b w:val="false"/>
+                <w:bCs w:val="false"/>
+                <w:color w:val="000000"/>
+                <w:sz w:val="18"/>
+                <w:szCs w:val="18"/>
+              </w:rPr>
+              <w:t xml:space="preserve">NOK 27.5bn (SEK 28.8bn)</w:t>
+            </w:r>
+          </w:p>
+        </w:tc>
+        <w:tc>
+          <w:tcPr>
+            <w:tcW w:type="dxa" w:w="1750"/>
+            <w:tcBorders>
+              <w:top w:val="single" w:color="BFBFBF" w:sz="4"/>
+              <w:left w:val="single" w:color="BFBFBF" w:sz="4"/>
+              <w:bottom w:val="single" w:color="BFBFBF" w:sz="4"/>
+              <w:right w:val="single" w:color="BFBFBF" w:sz="4"/>
+            </w:tcBorders>
+            <w:tcMar>
+              <w:top w:type="dxa" w:w="60"/>
+              <w:left w:type="dxa" w:w="100"/>
+              <w:bottom w:type="dxa" w:w="60"/>
+              <w:right w:type="dxa" w:w="100"/>
+            </w:tcMar>
+          </w:tcPr>
+          <w:p>
+            <w:r>
+              <w:rPr>
+                <w:rFonts w:ascii="Calibri" w:cs="Calibri" w:eastAsia="Calibri" w:hAnsi="Calibri"/>
+                <w:b w:val="false"/>
+                <w:bCs w:val="false"/>
+                <w:color w:val="000000"/>
+                <w:sz w:val="18"/>
+                <w:szCs w:val="18"/>
+              </w:rPr>
+              <w:t xml:space="preserve">DKK 19.5bn (SEK 29.2bn)</w:t>
+            </w:r>
+          </w:p>
+        </w:tc>
+        <w:tc>
+          <w:tcPr>
+            <w:tcW w:type="dxa" w:w="1776"/>
+            <w:tcBorders>
+              <w:top w:val="single" w:color="BFBFBF" w:sz="4"/>
+              <w:left w:val="single" w:color="BFBFBF" w:sz="4"/>
+              <w:bottom w:val="single" w:color="BFBFBF" w:sz="4"/>
+              <w:right w:val="single" w:color="BFBFBF" w:sz="4"/>
+            </w:tcBorders>
+            <w:tcMar>
+              <w:top w:type="dxa" w:w="60"/>
+              <w:left w:type="dxa" w:w="100"/>
+              <w:bottom w:type="dxa" w:w="60"/>
+              <w:right w:type="dxa" w:w="100"/>
+            </w:tcMar>
+          </w:tcPr>
+          <w:p>
+            <w:r>
+              <w:rPr>
+                <w:rFonts w:ascii="Calibri" w:cs="Calibri" w:eastAsia="Calibri" w:hAnsi="Calibri"/>
+                <w:b w:val="false"/>
+                <w:bCs w:val="false"/>
+                <w:color w:val="000000"/>
+                <w:sz w:val="18"/>
+                <w:szCs w:val="18"/>
+              </w:rPr>
+              <w:t xml:space="preserve">EUR 1.18bn (SEK 13.2bn); 2025: EUR 1.28bn</w:t>
+            </w:r>
+          </w:p>
+        </w:tc>
+      </w:tr>
+      <w:tr>
+        <w:tc>
+          <w:tcPr>
+            <w:tcW w:type="dxa" w:w="2000"/>
+            <w:tcBorders>
+              <w:top w:val="single" w:color="BFBFBF" w:sz="4"/>
+              <w:left w:val="single" w:color="BFBFBF" w:sz="4"/>
+              <w:bottom w:val="single" w:color="BFBFBF" w:sz="4"/>
+              <w:right w:val="single" w:color="BFBFBF" w:sz="4"/>
+            </w:tcBorders>
+            <w:tcMar>
+              <w:top w:type="dxa" w:w="60"/>
+              <w:left w:type="dxa" w:w="100"/>
+              <w:bottom w:type="dxa" w:w="60"/>
+              <w:right w:type="dxa" w:w="100"/>
+            </w:tcMar>
+          </w:tcPr>
+          <w:p>
+            <w:r>
+              <w:rPr>
+                <w:rFonts w:ascii="Calibri" w:cs="Calibri" w:eastAsia="Calibri" w:hAnsi="Calibri"/>
+                <w:b w:val="false"/>
+                <w:bCs w:val="false"/>
+                <w:color w:val="000000"/>
+                <w:sz w:val="18"/>
+                <w:szCs w:val="18"/>
+              </w:rPr>
+              <w:t xml:space="preserve">Business law (official / estimate)</w:t>
+            </w:r>
+          </w:p>
+        </w:tc>
+        <w:tc>
+          <w:tcPr>
+            <w:tcW w:type="dxa" w:w="1750"/>
+            <w:tcBorders>
+              <w:top w:val="single" w:color="BFBFBF" w:sz="4"/>
+              <w:left w:val="single" w:color="BFBFBF" w:sz="4"/>
+              <w:bottom w:val="single" w:color="BFBFBF" w:sz="4"/>
+              <w:right w:val="single" w:color="BFBFBF" w:sz="4"/>
+            </w:tcBorders>
+            <w:tcMar>
+              <w:top w:type="dxa" w:w="60"/>
+              <w:left w:type="dxa" w:w="100"/>
+              <w:bottom w:type="dxa" w:w="60"/>
+              <w:right w:type="dxa" w:w="100"/>
+            </w:tcMar>
+          </w:tcPr>
+          <w:p>
+            <w:r>
+              <w:rPr>
+                <w:rFonts w:ascii="Calibri" w:cs="Calibri" w:eastAsia="Calibri" w:hAnsi="Calibri"/>
+                <w:b w:val="false"/>
+                <w:bCs w:val="false"/>
+                <w:color w:val="000000"/>
+                <w:sz w:val="18"/>
+                <w:szCs w:val="18"/>
+              </w:rPr>
+              <w:t xml:space="preserve">SEK 16bn (panel floor) to &gt;25bn</w:t>
+            </w:r>
+          </w:p>
+        </w:tc>
+        <w:tc>
+          <w:tcPr>
+            <w:tcW w:type="dxa" w:w="1750"/>
+            <w:tcBorders>
+              <w:top w:val="single" w:color="BFBFBF" w:sz="4"/>
+              <w:left w:val="single" w:color="BFBFBF" w:sz="4"/>
+              <w:bottom w:val="single" w:color="BFBFBF" w:sz="4"/>
+              <w:right w:val="single" w:color="BFBFBF" w:sz="4"/>
+            </w:tcBorders>
+            <w:tcMar>
+              <w:top w:type="dxa" w:w="60"/>
+              <w:left w:type="dxa" w:w="100"/>
+              <w:bottom w:type="dxa" w:w="60"/>
+              <w:right w:type="dxa" w:w="100"/>
+            </w:tcMar>
+          </w:tcPr>
+          <w:p>
+            <w:r>
+              <w:rPr>
+                <w:rFonts w:ascii="Calibri" w:cs="Calibri" w:eastAsia="Calibri" w:hAnsi="Calibri"/>
+                <w:b w:val="false"/>
+                <w:bCs w:val="false"/>
+                <w:color w:val="000000"/>
+                <w:sz w:val="18"/>
+                <w:szCs w:val="18"/>
+              </w:rPr>
+              <w:t xml:space="preserve">NOK 15.6bn official (SEK 16.3bn), 57% of total</w:t>
+            </w:r>
+          </w:p>
+        </w:tc>
+        <w:tc>
+          <w:tcPr>
+            <w:tcW w:type="dxa" w:w="1750"/>
+            <w:tcBorders>
+              <w:top w:val="single" w:color="BFBFBF" w:sz="4"/>
+              <w:left w:val="single" w:color="BFBFBF" w:sz="4"/>
+              <w:bottom w:val="single" w:color="BFBFBF" w:sz="4"/>
+              <w:right w:val="single" w:color="BFBFBF" w:sz="4"/>
+            </w:tcBorders>
+            <w:tcMar>
+              <w:top w:type="dxa" w:w="60"/>
+              <w:left w:type="dxa" w:w="100"/>
+              <w:bottom w:type="dxa" w:w="60"/>
+              <w:right w:type="dxa" w:w="100"/>
+            </w:tcMar>
+          </w:tcPr>
+          <w:p>
+            <w:r>
+              <w:rPr>
+                <w:rFonts w:ascii="Calibri" w:cs="Calibri" w:eastAsia="Calibri" w:hAnsi="Calibri"/>
+                <w:b w:val="false"/>
+                <w:bCs w:val="false"/>
+                <w:color w:val="000000"/>
+                <w:sz w:val="18"/>
+                <w:szCs w:val="18"/>
+              </w:rPr>
+              <w:t xml:space="preserve">~DKK 13bn est. (SEK 19.5bn), ~67% business clients</w:t>
+            </w:r>
+          </w:p>
+        </w:tc>
+        <w:tc>
+          <w:tcPr>
+            <w:tcW w:type="dxa" w:w="1776"/>
+            <w:tcBorders>
+              <w:top w:val="single" w:color="BFBFBF" w:sz="4"/>
+              <w:left w:val="single" w:color="BFBFBF" w:sz="4"/>
+              <w:bottom w:val="single" w:color="BFBFBF" w:sz="4"/>
+              <w:right w:val="single" w:color="BFBFBF" w:sz="4"/>
+            </w:tcBorders>
+            <w:tcMar>
+              <w:top w:type="dxa" w:w="60"/>
+              <w:left w:type="dxa" w:w="100"/>
+              <w:bottom w:type="dxa" w:w="60"/>
+              <w:right w:type="dxa" w:w="100"/>
+            </w:tcMar>
+          </w:tcPr>
+          <w:p>
+            <w:r>
+              <w:rPr>
+                <w:rFonts w:ascii="Calibri" w:cs="Calibri" w:eastAsia="Calibri" w:hAnsi="Calibri"/>
+                <w:b w:val="false"/>
+                <w:bCs w:val="false"/>
+                <w:color w:val="000000"/>
+                <w:sz w:val="18"/>
+                <w:szCs w:val="18"/>
+              </w:rPr>
+              <w:t xml:space="preserve">~EUR 0.55-0.65bn est. (SEK 6-7bn)</w:t>
+            </w:r>
+          </w:p>
+        </w:tc>
+      </w:tr>
+      <w:tr>
+        <w:tc>
+          <w:tcPr>
+            <w:tcW w:type="dxa" w:w="2000"/>
+            <w:tcBorders>
+              <w:top w:val="single" w:color="BFBFBF" w:sz="4"/>
+              <w:left w:val="single" w:color="BFBFBF" w:sz="4"/>
+              <w:bottom w:val="single" w:color="BFBFBF" w:sz="4"/>
+              <w:right w:val="single" w:color="BFBFBF" w:sz="4"/>
+            </w:tcBorders>
+            <w:tcMar>
+              <w:top w:type="dxa" w:w="60"/>
+              <w:left w:type="dxa" w:w="100"/>
+              <w:bottom w:type="dxa" w:w="60"/>
+              <w:right w:type="dxa" w:w="100"/>
+            </w:tcMar>
+          </w:tcPr>
+          <w:p>
+            <w:r>
+              <w:rPr>
+                <w:rFonts w:ascii="Calibri" w:cs="Calibri" w:eastAsia="Calibri" w:hAnsi="Calibri"/>
+                <w:b w:val="false"/>
+                <w:bCs w:val="false"/>
+                <w:color w:val="000000"/>
+                <w:sz w:val="18"/>
+                <w:szCs w:val="18"/>
+              </w:rPr>
+              <w:t xml:space="preserve">Growth (local currency)</w:t>
+            </w:r>
+          </w:p>
+        </w:tc>
+        <w:tc>
+          <w:tcPr>
+            <w:tcW w:type="dxa" w:w="1750"/>
+            <w:tcBorders>
+              <w:top w:val="single" w:color="BFBFBF" w:sz="4"/>
+              <w:left w:val="single" w:color="BFBFBF" w:sz="4"/>
+              <w:bottom w:val="single" w:color="BFBFBF" w:sz="4"/>
+              <w:right w:val="single" w:color="BFBFBF" w:sz="4"/>
+            </w:tcBorders>
+            <w:tcMar>
+              <w:top w:type="dxa" w:w="60"/>
+              <w:left w:type="dxa" w:w="100"/>
+              <w:bottom w:type="dxa" w:w="60"/>
+              <w:right w:type="dxa" w:w="100"/>
+            </w:tcMar>
+          </w:tcPr>
+          <w:p>
+            <w:r>
+              <w:rPr>
+                <w:rFonts w:ascii="Calibri" w:cs="Calibri" w:eastAsia="Calibri" w:hAnsi="Calibri"/>
+                <w:b w:val="false"/>
+                <w:bCs w:val="false"/>
+                <w:color w:val="000000"/>
+                <w:sz w:val="18"/>
+                <w:szCs w:val="18"/>
+              </w:rPr>
+              <w:t xml:space="preserve">~8% p.a. 2022-24; 5.8% p.a. 2010-21</w:t>
+            </w:r>
+          </w:p>
+        </w:tc>
+        <w:tc>
+          <w:tcPr>
+            <w:tcW w:type="dxa" w:w="1750"/>
+            <w:tcBorders>
+              <w:top w:val="single" w:color="BFBFBF" w:sz="4"/>
+              <w:left w:val="single" w:color="BFBFBF" w:sz="4"/>
+              <w:bottom w:val="single" w:color="BFBFBF" w:sz="4"/>
+              <w:right w:val="single" w:color="BFBFBF" w:sz="4"/>
+            </w:tcBorders>
+            <w:tcMar>
+              <w:top w:type="dxa" w:w="60"/>
+              <w:left w:type="dxa" w:w="100"/>
+              <w:bottom w:type="dxa" w:w="60"/>
+              <w:right w:type="dxa" w:w="100"/>
+            </w:tcMar>
+          </w:tcPr>
+          <w:p>
+            <w:r>
+              <w:rPr>
+                <w:rFonts w:ascii="Calibri" w:cs="Calibri" w:eastAsia="Calibri" w:hAnsi="Calibri"/>
+                <w:b w:val="false"/>
+                <w:bCs w:val="false"/>
+                <w:color w:val="000000"/>
+                <w:sz w:val="18"/>
+                <w:szCs w:val="18"/>
+              </w:rPr>
+              <w:t xml:space="preserve">9.3% p.a. 2019-24; business law +14.9% in 2024</w:t>
+            </w:r>
+          </w:p>
+        </w:tc>
+        <w:tc>
+          <w:tcPr>
+            <w:tcW w:type="dxa" w:w="1750"/>
+            <w:tcBorders>
+              <w:top w:val="single" w:color="BFBFBF" w:sz="4"/>
+              <w:left w:val="single" w:color="BFBFBF" w:sz="4"/>
+              <w:bottom w:val="single" w:color="BFBFBF" w:sz="4"/>
+              <w:right w:val="single" w:color="BFBFBF" w:sz="4"/>
+            </w:tcBorders>
+            <w:tcMar>
+              <w:top w:type="dxa" w:w="60"/>
+              <w:left w:type="dxa" w:w="100"/>
+              <w:bottom w:type="dxa" w:w="60"/>
+              <w:right w:type="dxa" w:w="100"/>
+            </w:tcMar>
+          </w:tcPr>
+          <w:p>
+            <w:r>
+              <w:rPr>
+                <w:rFonts w:ascii="Calibri" w:cs="Calibri" w:eastAsia="Calibri" w:hAnsi="Calibri"/>
+                <w:b w:val="false"/>
+                <w:bCs w:val="false"/>
+                <w:color w:val="000000"/>
+                <w:sz w:val="18"/>
+                <w:szCs w:val="18"/>
+              </w:rPr>
+              <w:t xml:space="preserve">4.5% p.a. 2019-24</w:t>
+            </w:r>
+          </w:p>
+        </w:tc>
+        <w:tc>
+          <w:tcPr>
+            <w:tcW w:type="dxa" w:w="1776"/>
+            <w:tcBorders>
+              <w:top w:val="single" w:color="BFBFBF" w:sz="4"/>
+              <w:left w:val="single" w:color="BFBFBF" w:sz="4"/>
+              <w:bottom w:val="single" w:color="BFBFBF" w:sz="4"/>
+              <w:right w:val="single" w:color="BFBFBF" w:sz="4"/>
+            </w:tcBorders>
+            <w:tcMar>
+              <w:top w:type="dxa" w:w="60"/>
+              <w:left w:type="dxa" w:w="100"/>
+              <w:bottom w:type="dxa" w:w="60"/>
+              <w:right w:type="dxa" w:w="100"/>
+            </w:tcMar>
+          </w:tcPr>
+          <w:p>
+            <w:r>
+              <w:rPr>
+                <w:rFonts w:ascii="Calibri" w:cs="Calibri" w:eastAsia="Calibri" w:hAnsi="Calibri"/>
+                <w:b w:val="false"/>
+                <w:bCs w:val="false"/>
+                <w:color w:val="000000"/>
+                <w:sz w:val="18"/>
+                <w:szCs w:val="18"/>
+              </w:rPr>
+              <w:t xml:space="preserve">4.9% p.a. 2019-25; +8.4% in 2025</w:t>
+            </w:r>
+          </w:p>
+        </w:tc>
+      </w:tr>
+      <w:tr>
+        <w:tc>
+          <w:tcPr>
+            <w:tcW w:type="dxa" w:w="2000"/>
+            <w:tcBorders>
+              <w:top w:val="single" w:color="BFBFBF" w:sz="4"/>
+              <w:left w:val="single" w:color="BFBFBF" w:sz="4"/>
+              <w:bottom w:val="single" w:color="BFBFBF" w:sz="4"/>
+              <w:right w:val="single" w:color="BFBFBF" w:sz="4"/>
+            </w:tcBorders>
+            <w:tcMar>
+              <w:top w:type="dxa" w:w="60"/>
+              <w:left w:type="dxa" w:w="100"/>
+              <w:bottom w:type="dxa" w:w="60"/>
+              <w:right w:type="dxa" w:w="100"/>
+            </w:tcMar>
+          </w:tcPr>
+          <w:p>
+            <w:r>
+              <w:rPr>
+                <w:rFonts w:ascii="Calibri" w:cs="Calibri" w:eastAsia="Calibri" w:hAnsi="Calibri"/>
+                <w:b w:val="false"/>
+                <w:bCs w:val="false"/>
+                <w:color w:val="000000"/>
+                <w:sz w:val="18"/>
+                <w:szCs w:val="18"/>
+              </w:rPr>
+              <w:t xml:space="preserve">Enterprises / employees (Eurostat 2024)</w:t>
+            </w:r>
+          </w:p>
+        </w:tc>
+        <w:tc>
+          <w:tcPr>
+            <w:tcW w:type="dxa" w:w="1750"/>
+            <w:tcBorders>
+              <w:top w:val="single" w:color="BFBFBF" w:sz="4"/>
+              <w:left w:val="single" w:color="BFBFBF" w:sz="4"/>
+              <w:bottom w:val="single" w:color="BFBFBF" w:sz="4"/>
+              <w:right w:val="single" w:color="BFBFBF" w:sz="4"/>
+            </w:tcBorders>
+            <w:tcMar>
+              <w:top w:type="dxa" w:w="60"/>
+              <w:left w:type="dxa" w:w="100"/>
+              <w:bottom w:type="dxa" w:w="60"/>
+              <w:right w:type="dxa" w:w="100"/>
+            </w:tcMar>
+          </w:tcPr>
+          <w:p>
+            <w:r>
+              <w:rPr>
+                <w:rFonts w:ascii="Calibri" w:cs="Calibri" w:eastAsia="Calibri" w:hAnsi="Calibri"/>
+                <w:b w:val="false"/>
+                <w:bCs w:val="false"/>
+                <w:color w:val="000000"/>
+                <w:sz w:val="18"/>
+                <w:szCs w:val="18"/>
+              </w:rPr>
+              <w:t xml:space="preserve">6,965 / 17,521</w:t>
+            </w:r>
+          </w:p>
+        </w:tc>
+        <w:tc>
+          <w:tcPr>
+            <w:tcW w:type="dxa" w:w="1750"/>
+            <w:tcBorders>
+              <w:top w:val="single" w:color="BFBFBF" w:sz="4"/>
+              <w:left w:val="single" w:color="BFBFBF" w:sz="4"/>
+              <w:bottom w:val="single" w:color="BFBFBF" w:sz="4"/>
+              <w:right w:val="single" w:color="BFBFBF" w:sz="4"/>
+            </w:tcBorders>
+            <w:tcMar>
+              <w:top w:type="dxa" w:w="60"/>
+              <w:left w:type="dxa" w:w="100"/>
+              <w:bottom w:type="dxa" w:w="60"/>
+              <w:right w:type="dxa" w:w="100"/>
+            </w:tcMar>
+          </w:tcPr>
+          <w:p>
+            <w:r>
+              <w:rPr>
+                <w:rFonts w:ascii="Calibri" w:cs="Calibri" w:eastAsia="Calibri" w:hAnsi="Calibri"/>
+                <w:b w:val="false"/>
+                <w:bCs w:val="false"/>
+                <w:color w:val="000000"/>
+                <w:sz w:val="18"/>
+                <w:szCs w:val="18"/>
+              </w:rPr>
+              <w:t xml:space="preserve">2,214 / 9,264</w:t>
+            </w:r>
+          </w:p>
+        </w:tc>
+        <w:tc>
+          <w:tcPr>
+            <w:tcW w:type="dxa" w:w="1750"/>
+            <w:tcBorders>
+              <w:top w:val="single" w:color="BFBFBF" w:sz="4"/>
+              <w:left w:val="single" w:color="BFBFBF" w:sz="4"/>
+              <w:bottom w:val="single" w:color="BFBFBF" w:sz="4"/>
+              <w:right w:val="single" w:color="BFBFBF" w:sz="4"/>
+            </w:tcBorders>
+            <w:tcMar>
+              <w:top w:type="dxa" w:w="60"/>
+              <w:left w:type="dxa" w:w="100"/>
+              <w:bottom w:type="dxa" w:w="60"/>
+              <w:right w:type="dxa" w:w="100"/>
+            </w:tcMar>
+          </w:tcPr>
+          <w:p>
+            <w:r>
+              <w:rPr>
+                <w:rFonts w:ascii="Calibri" w:cs="Calibri" w:eastAsia="Calibri" w:hAnsi="Calibri"/>
+                <w:b w:val="false"/>
+                <w:bCs w:val="false"/>
+                <w:color w:val="000000"/>
+                <w:sz w:val="18"/>
+                <w:szCs w:val="18"/>
+              </w:rPr>
+              <w:t xml:space="preserve">1,912 / 13,158</w:t>
+            </w:r>
+          </w:p>
+        </w:tc>
+        <w:tc>
+          <w:tcPr>
+            <w:tcW w:type="dxa" w:w="1776"/>
+            <w:tcBorders>
+              <w:top w:val="single" w:color="BFBFBF" w:sz="4"/>
+              <w:left w:val="single" w:color="BFBFBF" w:sz="4"/>
+              <w:bottom w:val="single" w:color="BFBFBF" w:sz="4"/>
+              <w:right w:val="single" w:color="BFBFBF" w:sz="4"/>
+            </w:tcBorders>
+            <w:tcMar>
+              <w:top w:type="dxa" w:w="60"/>
+              <w:left w:type="dxa" w:w="100"/>
+              <w:bottom w:type="dxa" w:w="60"/>
+              <w:right w:type="dxa" w:w="100"/>
+            </w:tcMar>
+          </w:tcPr>
+          <w:p>
+            <w:r>
+              <w:rPr>
+                <w:rFonts w:ascii="Calibri" w:cs="Calibri" w:eastAsia="Calibri" w:hAnsi="Calibri"/>
+                <w:b w:val="false"/>
+                <w:bCs w:val="false"/>
+                <w:color w:val="000000"/>
+                <w:sz w:val="18"/>
+                <w:szCs w:val="18"/>
+              </w:rPr>
+              <w:t xml:space="preserve">2,726 / 6,509</w:t>
+            </w:r>
+          </w:p>
+        </w:tc>
+      </w:tr>
+      <w:tr>
+        <w:tc>
+          <w:tcPr>
+            <w:tcW w:type="dxa" w:w="2000"/>
+            <w:tcBorders>
+              <w:top w:val="single" w:color="BFBFBF" w:sz="4"/>
+              <w:left w:val="single" w:color="BFBFBF" w:sz="4"/>
+              <w:bottom w:val="single" w:color="BFBFBF" w:sz="4"/>
+              <w:right w:val="single" w:color="BFBFBF" w:sz="4"/>
+            </w:tcBorders>
+            <w:tcMar>
+              <w:top w:type="dxa" w:w="60"/>
+              <w:left w:type="dxa" w:w="100"/>
+              <w:bottom w:type="dxa" w:w="60"/>
+              <w:right w:type="dxa" w:w="100"/>
+            </w:tcMar>
+          </w:tcPr>
+          <w:p>
+            <w:r>
+              <w:rPr>
+                <w:rFonts w:ascii="Calibri" w:cs="Calibri" w:eastAsia="Calibri" w:hAnsi="Calibri"/>
+                <w:b w:val="false"/>
+                <w:bCs w:val="false"/>
+                <w:color w:val="000000"/>
+                <w:sz w:val="18"/>
+                <w:szCs w:val="18"/>
+              </w:rPr>
+              <w:t xml:space="preserve">Turnover per employee (EUR k, 2024)</w:t>
+            </w:r>
+          </w:p>
+        </w:tc>
+        <w:tc>
+          <w:tcPr>
+            <w:tcW w:type="dxa" w:w="1750"/>
+            <w:tcBorders>
+              <w:top w:val="single" w:color="BFBFBF" w:sz="4"/>
+              <w:left w:val="single" w:color="BFBFBF" w:sz="4"/>
+              <w:bottom w:val="single" w:color="BFBFBF" w:sz="4"/>
+              <w:right w:val="single" w:color="BFBFBF" w:sz="4"/>
+            </w:tcBorders>
+            <w:tcMar>
+              <w:top w:type="dxa" w:w="60"/>
+              <w:left w:type="dxa" w:w="100"/>
+              <w:bottom w:type="dxa" w:w="60"/>
+              <w:right w:type="dxa" w:w="100"/>
+            </w:tcMar>
+          </w:tcPr>
+          <w:p>
+            <w:r>
+              <w:rPr>
+                <w:rFonts w:ascii="Calibri" w:cs="Calibri" w:eastAsia="Calibri" w:hAnsi="Calibri"/>
+                <w:b w:val="false"/>
+                <w:bCs w:val="false"/>
+                <w:color w:val="000000"/>
+                <w:sz w:val="18"/>
+                <w:szCs w:val="18"/>
+              </w:rPr>
+              <w:t xml:space="preserve">194</w:t>
+            </w:r>
+          </w:p>
+        </w:tc>
+        <w:tc>
+          <w:tcPr>
+            <w:tcW w:type="dxa" w:w="1750"/>
+            <w:tcBorders>
+              <w:top w:val="single" w:color="BFBFBF" w:sz="4"/>
+              <w:left w:val="single" w:color="BFBFBF" w:sz="4"/>
+              <w:bottom w:val="single" w:color="BFBFBF" w:sz="4"/>
+              <w:right w:val="single" w:color="BFBFBF" w:sz="4"/>
+            </w:tcBorders>
+            <w:tcMar>
+              <w:top w:type="dxa" w:w="60"/>
+              <w:left w:type="dxa" w:w="100"/>
+              <w:bottom w:type="dxa" w:w="60"/>
+              <w:right w:type="dxa" w:w="100"/>
+            </w:tcMar>
+          </w:tcPr>
+          <w:p>
+            <w:r>
+              <w:rPr>
+                <w:rFonts w:ascii="Calibri" w:cs="Calibri" w:eastAsia="Calibri" w:hAnsi="Calibri"/>
+                <w:b w:val="false"/>
+                <w:bCs w:val="false"/>
+                <w:color w:val="000000"/>
+                <w:sz w:val="18"/>
+                <w:szCs w:val="18"/>
+              </w:rPr>
+              <w:t xml:space="preserve">255</w:t>
+            </w:r>
+          </w:p>
+        </w:tc>
+        <w:tc>
+          <w:tcPr>
+            <w:tcW w:type="dxa" w:w="1750"/>
+            <w:tcBorders>
+              <w:top w:val="single" w:color="BFBFBF" w:sz="4"/>
+              <w:left w:val="single" w:color="BFBFBF" w:sz="4"/>
+              <w:bottom w:val="single" w:color="BFBFBF" w:sz="4"/>
+              <w:right w:val="single" w:color="BFBFBF" w:sz="4"/>
+            </w:tcBorders>
+            <w:tcMar>
+              <w:top w:type="dxa" w:w="60"/>
+              <w:left w:type="dxa" w:w="100"/>
+              <w:bottom w:type="dxa" w:w="60"/>
+              <w:right w:type="dxa" w:w="100"/>
+            </w:tcMar>
+          </w:tcPr>
+          <w:p>
+            <w:r>
+              <w:rPr>
+                <w:rFonts w:ascii="Calibri" w:cs="Calibri" w:eastAsia="Calibri" w:hAnsi="Calibri"/>
+                <w:b w:val="false"/>
+                <w:bCs w:val="false"/>
+                <w:color w:val="000000"/>
+                <w:sz w:val="18"/>
+                <w:szCs w:val="18"/>
+              </w:rPr>
+              <w:t xml:space="preserve">198</w:t>
+            </w:r>
+          </w:p>
+        </w:tc>
+        <w:tc>
+          <w:tcPr>
+            <w:tcW w:type="dxa" w:w="1776"/>
+            <w:tcBorders>
+              <w:top w:val="single" w:color="BFBFBF" w:sz="4"/>
+              <w:left w:val="single" w:color="BFBFBF" w:sz="4"/>
+              <w:bottom w:val="single" w:color="BFBFBF" w:sz="4"/>
+              <w:right w:val="single" w:color="BFBFBF" w:sz="4"/>
+            </w:tcBorders>
+            <w:tcMar>
+              <w:top w:type="dxa" w:w="60"/>
+              <w:left w:type="dxa" w:w="100"/>
+              <w:bottom w:type="dxa" w:w="60"/>
+              <w:right w:type="dxa" w:w="100"/>
+            </w:tcMar>
+          </w:tcPr>
+          <w:p>
+            <w:r>
+              <w:rPr>
+                <w:rFonts w:ascii="Calibri" w:cs="Calibri" w:eastAsia="Calibri" w:hAnsi="Calibri"/>
+                <w:b w:val="false"/>
+                <w:bCs w:val="false"/>
+                <w:color w:val="000000"/>
+                <w:sz w:val="18"/>
+                <w:szCs w:val="18"/>
+              </w:rPr>
+              <w:t xml:space="preserve">181</w:t>
+            </w:r>
+          </w:p>
+        </w:tc>
+      </w:tr>
+      <w:tr>
+        <w:tc>
+          <w:tcPr>
+            <w:tcW w:type="dxa" w:w="2000"/>
+            <w:tcBorders>
+              <w:top w:val="single" w:color="BFBFBF" w:sz="4"/>
+              <w:left w:val="single" w:color="BFBFBF" w:sz="4"/>
+              <w:bottom w:val="single" w:color="BFBFBF" w:sz="4"/>
+              <w:right w:val="single" w:color="BFBFBF" w:sz="4"/>
+            </w:tcBorders>
+            <w:tcMar>
+              <w:top w:type="dxa" w:w="60"/>
+              <w:left w:type="dxa" w:w="100"/>
+              <w:bottom w:type="dxa" w:w="60"/>
+              <w:right w:type="dxa" w:w="100"/>
+            </w:tcMar>
+          </w:tcPr>
+          <w:p>
+            <w:r>
+              <w:rPr>
+                <w:rFonts w:ascii="Calibri" w:cs="Calibri" w:eastAsia="Calibri" w:hAnsi="Calibri"/>
+                <w:b w:val="false"/>
+                <w:bCs w:val="false"/>
+                <w:color w:val="000000"/>
+                <w:sz w:val="18"/>
+                <w:szCs w:val="18"/>
+              </w:rPr>
+              <w:t xml:space="preserve">Lawyers</w:t>
+            </w:r>
+          </w:p>
+        </w:tc>
+        <w:tc>
+          <w:tcPr>
+            <w:tcW w:type="dxa" w:w="1750"/>
+            <w:tcBorders>
+              <w:top w:val="single" w:color="BFBFBF" w:sz="4"/>
+              <w:left w:val="single" w:color="BFBFBF" w:sz="4"/>
+              <w:bottom w:val="single" w:color="BFBFBF" w:sz="4"/>
+              <w:right w:val="single" w:color="BFBFBF" w:sz="4"/>
+            </w:tcBorders>
+            <w:tcMar>
+              <w:top w:type="dxa" w:w="60"/>
+              <w:left w:type="dxa" w:w="100"/>
+              <w:bottom w:type="dxa" w:w="60"/>
+              <w:right w:type="dxa" w:w="100"/>
+            </w:tcMar>
+          </w:tcPr>
+          <w:p>
+            <w:r>
+              <w:rPr>
+                <w:rFonts w:ascii="Calibri" w:cs="Calibri" w:eastAsia="Calibri" w:hAnsi="Calibri"/>
+                <w:b w:val="false"/>
+                <w:bCs w:val="false"/>
+                <w:color w:val="000000"/>
+                <w:sz w:val="18"/>
+                <w:szCs w:val="18"/>
+              </w:rPr>
+              <w:t xml:space="preserve">6,712 Bar members (5,963 practising)</w:t>
+            </w:r>
+          </w:p>
+        </w:tc>
+        <w:tc>
+          <w:tcPr>
+            <w:tcW w:type="dxa" w:w="1750"/>
+            <w:tcBorders>
+              <w:top w:val="single" w:color="BFBFBF" w:sz="4"/>
+              <w:left w:val="single" w:color="BFBFBF" w:sz="4"/>
+              <w:bottom w:val="single" w:color="BFBFBF" w:sz="4"/>
+              <w:right w:val="single" w:color="BFBFBF" w:sz="4"/>
+            </w:tcBorders>
+            <w:tcMar>
+              <w:top w:type="dxa" w:w="60"/>
+              <w:left w:type="dxa" w:w="100"/>
+              <w:bottom w:type="dxa" w:w="60"/>
+              <w:right w:type="dxa" w:w="100"/>
+            </w:tcMar>
+          </w:tcPr>
+          <w:p>
+            <w:r>
+              <w:rPr>
+                <w:rFonts w:ascii="Calibri" w:cs="Calibri" w:eastAsia="Calibri" w:hAnsi="Calibri"/>
+                <w:b w:val="false"/>
+                <w:bCs w:val="false"/>
+                <w:color w:val="000000"/>
+                <w:sz w:val="18"/>
+                <w:szCs w:val="18"/>
+              </w:rPr>
+              <w:t xml:space="preserve">10,756 Bar members incl. trainees</w:t>
+            </w:r>
+          </w:p>
+        </w:tc>
+        <w:tc>
+          <w:tcPr>
+            <w:tcW w:type="dxa" w:w="1750"/>
+            <w:tcBorders>
+              <w:top w:val="single" w:color="BFBFBF" w:sz="4"/>
+              <w:left w:val="single" w:color="BFBFBF" w:sz="4"/>
+              <w:bottom w:val="single" w:color="BFBFBF" w:sz="4"/>
+              <w:right w:val="single" w:color="BFBFBF" w:sz="4"/>
+            </w:tcBorders>
+            <w:tcMar>
+              <w:top w:type="dxa" w:w="60"/>
+              <w:left w:type="dxa" w:w="100"/>
+              <w:bottom w:type="dxa" w:w="60"/>
+              <w:right w:type="dxa" w:w="100"/>
+            </w:tcMar>
+          </w:tcPr>
+          <w:p>
+            <w:r>
+              <w:rPr>
+                <w:rFonts w:ascii="Calibri" w:cs="Calibri" w:eastAsia="Calibri" w:hAnsi="Calibri"/>
+                <w:b w:val="false"/>
+                <w:bCs w:val="false"/>
+                <w:color w:val="000000"/>
+                <w:sz w:val="18"/>
+                <w:szCs w:val="18"/>
+              </w:rPr>
+              <w:t xml:space="preserve">~7,760 incl. in-house</w:t>
+            </w:r>
+          </w:p>
+        </w:tc>
+        <w:tc>
+          <w:tcPr>
+            <w:tcW w:type="dxa" w:w="1776"/>
+            <w:tcBorders>
+              <w:top w:val="single" w:color="BFBFBF" w:sz="4"/>
+              <w:left w:val="single" w:color="BFBFBF" w:sz="4"/>
+              <w:bottom w:val="single" w:color="BFBFBF" w:sz="4"/>
+              <w:right w:val="single" w:color="BFBFBF" w:sz="4"/>
+            </w:tcBorders>
+            <w:tcMar>
+              <w:top w:type="dxa" w:w="60"/>
+              <w:left w:type="dxa" w:w="100"/>
+              <w:bottom w:type="dxa" w:w="60"/>
+              <w:right w:type="dxa" w:w="100"/>
+            </w:tcMar>
+          </w:tcPr>
+          <w:p>
+            <w:r>
+              <w:rPr>
+                <w:rFonts w:ascii="Calibri" w:cs="Calibri" w:eastAsia="Calibri" w:hAnsi="Calibri"/>
+                <w:b w:val="false"/>
+                <w:bCs w:val="false"/>
+                <w:color w:val="000000"/>
+                <w:sz w:val="18"/>
+                <w:szCs w:val="18"/>
+              </w:rPr>
+              <w:t xml:space="preserve">2,443 asianajajat + 1,778 licensed counsel</w:t>
+            </w:r>
+          </w:p>
+        </w:tc>
+      </w:tr>
+      <w:tr>
+        <w:tc>
+          <w:tcPr>
+            <w:tcW w:type="dxa" w:w="2000"/>
+            <w:tcBorders>
+              <w:top w:val="single" w:color="BFBFBF" w:sz="4"/>
+              <w:left w:val="single" w:color="BFBFBF" w:sz="4"/>
+              <w:bottom w:val="single" w:color="BFBFBF" w:sz="4"/>
+              <w:right w:val="single" w:color="BFBFBF" w:sz="4"/>
+            </w:tcBorders>
+            <w:tcMar>
+              <w:top w:type="dxa" w:w="60"/>
+              <w:left w:type="dxa" w:w="100"/>
+              <w:bottom w:type="dxa" w:w="60"/>
+              <w:right w:type="dxa" w:w="100"/>
+            </w:tcMar>
+          </w:tcPr>
+          <w:p>
+            <w:r>
+              <w:rPr>
+                <w:rFonts w:ascii="Calibri" w:cs="Calibri" w:eastAsia="Calibri" w:hAnsi="Calibri"/>
+                <w:b w:val="false"/>
+                <w:bCs w:val="false"/>
+                <w:color w:val="000000"/>
+                <w:sz w:val="18"/>
+                <w:szCs w:val="18"/>
+              </w:rPr>
+              <w:t xml:space="preserve">Largest firm</w:t>
+            </w:r>
+          </w:p>
+        </w:tc>
+        <w:tc>
+          <w:tcPr>
+            <w:tcW w:type="dxa" w:w="1750"/>
+            <w:tcBorders>
+              <w:top w:val="single" w:color="BFBFBF" w:sz="4"/>
+              <w:left w:val="single" w:color="BFBFBF" w:sz="4"/>
+              <w:bottom w:val="single" w:color="BFBFBF" w:sz="4"/>
+              <w:right w:val="single" w:color="BFBFBF" w:sz="4"/>
+            </w:tcBorders>
+            <w:tcMar>
+              <w:top w:type="dxa" w:w="60"/>
+              <w:left w:type="dxa" w:w="100"/>
+              <w:bottom w:type="dxa" w:w="60"/>
+              <w:right w:type="dxa" w:w="100"/>
+            </w:tcMar>
+          </w:tcPr>
+          <w:p>
+            <w:r>
+              <w:rPr>
+                <w:rFonts w:ascii="Calibri" w:cs="Calibri" w:eastAsia="Calibri" w:hAnsi="Calibri"/>
+                <w:b w:val="false"/>
+                <w:bCs w:val="false"/>
+                <w:color w:val="000000"/>
+                <w:sz w:val="18"/>
+                <w:szCs w:val="18"/>
+              </w:rPr>
+              <w:t xml:space="preserve">Vinge SEK 2.04bn (2025)</w:t>
+            </w:r>
+          </w:p>
+        </w:tc>
+        <w:tc>
+          <w:tcPr>
+            <w:tcW w:type="dxa" w:w="1750"/>
+            <w:tcBorders>
+              <w:top w:val="single" w:color="BFBFBF" w:sz="4"/>
+              <w:left w:val="single" w:color="BFBFBF" w:sz="4"/>
+              <w:bottom w:val="single" w:color="BFBFBF" w:sz="4"/>
+              <w:right w:val="single" w:color="BFBFBF" w:sz="4"/>
+            </w:tcBorders>
+            <w:tcMar>
+              <w:top w:type="dxa" w:w="60"/>
+              <w:left w:type="dxa" w:w="100"/>
+              <w:bottom w:type="dxa" w:w="60"/>
+              <w:right w:type="dxa" w:w="100"/>
+            </w:tcMar>
+          </w:tcPr>
+          <w:p>
+            <w:r>
+              <w:rPr>
+                <w:rFonts w:ascii="Calibri" w:cs="Calibri" w:eastAsia="Calibri" w:hAnsi="Calibri"/>
+                <w:b w:val="false"/>
+                <w:bCs w:val="false"/>
+                <w:color w:val="000000"/>
+                <w:sz w:val="18"/>
+                <w:szCs w:val="18"/>
+              </w:rPr>
+              <w:t xml:space="preserve">Schjødt NOK 2.50bn (2025, consolidated)</w:t>
+            </w:r>
+          </w:p>
+        </w:tc>
+        <w:tc>
+          <w:tcPr>
+            <w:tcW w:type="dxa" w:w="1750"/>
+            <w:tcBorders>
+              <w:top w:val="single" w:color="BFBFBF" w:sz="4"/>
+              <w:left w:val="single" w:color="BFBFBF" w:sz="4"/>
+              <w:bottom w:val="single" w:color="BFBFBF" w:sz="4"/>
+              <w:right w:val="single" w:color="BFBFBF" w:sz="4"/>
+            </w:tcBorders>
+            <w:tcMar>
+              <w:top w:type="dxa" w:w="60"/>
+              <w:left w:type="dxa" w:w="100"/>
+              <w:bottom w:type="dxa" w:w="60"/>
+              <w:right w:type="dxa" w:w="100"/>
+            </w:tcMar>
+          </w:tcPr>
+          <w:p>
+            <w:r>
+              <w:rPr>
+                <w:rFonts w:ascii="Calibri" w:cs="Calibri" w:eastAsia="Calibri" w:hAnsi="Calibri"/>
+                <w:b w:val="false"/>
+                <w:bCs w:val="false"/>
+                <w:color w:val="000000"/>
+                <w:sz w:val="18"/>
+                <w:szCs w:val="18"/>
+              </w:rPr>
+              <w:t xml:space="preserve">Gorrissen Federspiel DKK 1.31bn (2025)</w:t>
+            </w:r>
+          </w:p>
+        </w:tc>
+        <w:tc>
+          <w:tcPr>
+            <w:tcW w:type="dxa" w:w="1776"/>
+            <w:tcBorders>
+              <w:top w:val="single" w:color="BFBFBF" w:sz="4"/>
+              <w:left w:val="single" w:color="BFBFBF" w:sz="4"/>
+              <w:bottom w:val="single" w:color="BFBFBF" w:sz="4"/>
+              <w:right w:val="single" w:color="BFBFBF" w:sz="4"/>
+            </w:tcBorders>
+            <w:tcMar>
+              <w:top w:type="dxa" w:w="60"/>
+              <w:left w:type="dxa" w:w="100"/>
+              <w:bottom w:type="dxa" w:w="60"/>
+              <w:right w:type="dxa" w:w="100"/>
+            </w:tcMar>
+          </w:tcPr>
+          <w:p>
+            <w:r>
+              <w:rPr>
+                <w:rFonts w:ascii="Calibri" w:cs="Calibri" w:eastAsia="Calibri" w:hAnsi="Calibri"/>
+                <w:b w:val="false"/>
+                <w:bCs w:val="false"/>
+                <w:color w:val="000000"/>
+                <w:sz w:val="18"/>
+                <w:szCs w:val="18"/>
+              </w:rPr>
+              <w:t xml:space="preserve">Roschier EUR 99m (FY05/2026)</w:t>
+            </w:r>
+          </w:p>
+        </w:tc>
+      </w:tr>
+      <w:tr>
+        <w:tc>
+          <w:tcPr>
+            <w:tcW w:type="dxa" w:w="2000"/>
+            <w:tcBorders>
+              <w:top w:val="single" w:color="BFBFBF" w:sz="4"/>
+              <w:left w:val="single" w:color="BFBFBF" w:sz="4"/>
+              <w:bottom w:val="single" w:color="BFBFBF" w:sz="4"/>
+              <w:right w:val="single" w:color="BFBFBF" w:sz="4"/>
+            </w:tcBorders>
+            <w:tcMar>
+              <w:top w:type="dxa" w:w="60"/>
+              <w:left w:type="dxa" w:w="100"/>
+              <w:bottom w:type="dxa" w:w="60"/>
+              <w:right w:type="dxa" w:w="100"/>
+            </w:tcMar>
+          </w:tcPr>
+          <w:p>
+            <w:r>
+              <w:rPr>
+                <w:rFonts w:ascii="Calibri" w:cs="Calibri" w:eastAsia="Calibri" w:hAnsi="Calibri"/>
+                <w:b w:val="false"/>
+                <w:bCs w:val="false"/>
+                <w:color w:val="000000"/>
+                <w:sz w:val="18"/>
+                <w:szCs w:val="18"/>
+              </w:rPr>
+              <w:t xml:space="preserve">Concentration</w:t>
+            </w:r>
+          </w:p>
+        </w:tc>
+        <w:tc>
+          <w:tcPr>
+            <w:tcW w:type="dxa" w:w="1750"/>
+            <w:tcBorders>
+              <w:top w:val="single" w:color="BFBFBF" w:sz="4"/>
+              <w:left w:val="single" w:color="BFBFBF" w:sz="4"/>
+              <w:bottom w:val="single" w:color="BFBFBF" w:sz="4"/>
+              <w:right w:val="single" w:color="BFBFBF" w:sz="4"/>
+            </w:tcBorders>
+            <w:tcMar>
+              <w:top w:type="dxa" w:w="60"/>
+              <w:left w:type="dxa" w:w="100"/>
+              <w:bottom w:type="dxa" w:w="60"/>
+              <w:right w:type="dxa" w:w="100"/>
+            </w:tcMar>
+          </w:tcPr>
+          <w:p>
+            <w:r>
+              <w:rPr>
+                <w:rFonts w:ascii="Calibri" w:cs="Calibri" w:eastAsia="Calibri" w:hAnsi="Calibri"/>
+                <w:b w:val="false"/>
+                <w:bCs w:val="false"/>
+                <w:color w:val="000000"/>
+                <w:sz w:val="18"/>
+                <w:szCs w:val="18"/>
+              </w:rPr>
+              <w:t xml:space="preserve">Top-5 ~46%, top-10 ~66% of Afv panel</w:t>
+            </w:r>
+          </w:p>
+        </w:tc>
+        <w:tc>
+          <w:tcPr>
+            <w:tcW w:type="dxa" w:w="1750"/>
+            <w:tcBorders>
+              <w:top w:val="single" w:color="BFBFBF" w:sz="4"/>
+              <w:left w:val="single" w:color="BFBFBF" w:sz="4"/>
+              <w:bottom w:val="single" w:color="BFBFBF" w:sz="4"/>
+              <w:right w:val="single" w:color="BFBFBF" w:sz="4"/>
+            </w:tcBorders>
+            <w:tcMar>
+              <w:top w:type="dxa" w:w="60"/>
+              <w:left w:type="dxa" w:w="100"/>
+              <w:bottom w:type="dxa" w:w="60"/>
+              <w:right w:type="dxa" w:w="100"/>
+            </w:tcMar>
+          </w:tcPr>
+          <w:p>
+            <w:r>
+              <w:rPr>
+                <w:rFonts w:ascii="Calibri" w:cs="Calibri" w:eastAsia="Calibri" w:hAnsi="Calibri"/>
+                <w:b w:val="false"/>
+                <w:bCs w:val="false"/>
+                <w:color w:val="000000"/>
+                <w:sz w:val="18"/>
+                <w:szCs w:val="18"/>
+              </w:rPr>
+              <w:t xml:space="preserve">Top-5 ~31% of sector (NOK 9.4bn, 2025)</w:t>
+            </w:r>
+          </w:p>
+        </w:tc>
+        <w:tc>
+          <w:tcPr>
+            <w:tcW w:type="dxa" w:w="1750"/>
+            <w:tcBorders>
+              <w:top w:val="single" w:color="BFBFBF" w:sz="4"/>
+              <w:left w:val="single" w:color="BFBFBF" w:sz="4"/>
+              <w:bottom w:val="single" w:color="BFBFBF" w:sz="4"/>
+              <w:right w:val="single" w:color="BFBFBF" w:sz="4"/>
+            </w:tcBorders>
+            <w:tcMar>
+              <w:top w:type="dxa" w:w="60"/>
+              <w:left w:type="dxa" w:w="100"/>
+              <w:bottom w:type="dxa" w:w="60"/>
+              <w:right w:type="dxa" w:w="100"/>
+            </w:tcMar>
+          </w:tcPr>
+          <w:p>
+            <w:r>
+              <w:rPr>
+                <w:rFonts w:ascii="Calibri" w:cs="Calibri" w:eastAsia="Calibri" w:hAnsi="Calibri"/>
+                <w:b w:val="false"/>
+                <w:bCs w:val="false"/>
+                <w:color w:val="000000"/>
+                <w:sz w:val="18"/>
+                <w:szCs w:val="18"/>
+              </w:rPr>
+              <w:t xml:space="preserve">Top-10 ~44% (2022) to ~47-49% (2025e)</w:t>
+            </w:r>
+          </w:p>
+        </w:tc>
+        <w:tc>
+          <w:tcPr>
+            <w:tcW w:type="dxa" w:w="1776"/>
+            <w:tcBorders>
+              <w:top w:val="single" w:color="BFBFBF" w:sz="4"/>
+              <w:left w:val="single" w:color="BFBFBF" w:sz="4"/>
+              <w:bottom w:val="single" w:color="BFBFBF" w:sz="4"/>
+              <w:right w:val="single" w:color="BFBFBF" w:sz="4"/>
+            </w:tcBorders>
+            <w:tcMar>
+              <w:top w:type="dxa" w:w="60"/>
+              <w:left w:type="dxa" w:w="100"/>
+              <w:bottom w:type="dxa" w:w="60"/>
+              <w:right w:type="dxa" w:w="100"/>
+            </w:tcMar>
+          </w:tcPr>
+          <w:p>
+            <w:r>
+              <w:rPr>
+                <w:rFonts w:ascii="Calibri" w:cs="Calibri" w:eastAsia="Calibri" w:hAnsi="Calibri"/>
+                <w:b w:val="false"/>
+                <w:bCs w:val="false"/>
+                <w:color w:val="000000"/>
+                <w:sz w:val="18"/>
+                <w:szCs w:val="18"/>
+              </w:rPr>
+              <w:t xml:space="preserve">Top-5 ~27% of sector; ~55% of top-30</w:t>
+            </w:r>
+          </w:p>
+        </w:tc>
+      </w:tr>
+      <w:tr>
+        <w:tc>
+          <w:tcPr>
+            <w:tcW w:type="dxa" w:w="2000"/>
+            <w:tcBorders>
+              <w:top w:val="single" w:color="BFBFBF" w:sz="4"/>
+              <w:left w:val="single" w:color="BFBFBF" w:sz="4"/>
+              <w:bottom w:val="single" w:color="BFBFBF" w:sz="4"/>
+              <w:right w:val="single" w:color="BFBFBF" w:sz="4"/>
+            </w:tcBorders>
+            <w:tcMar>
+              <w:top w:type="dxa" w:w="60"/>
+              <w:left w:type="dxa" w:w="100"/>
+              <w:bottom w:type="dxa" w:w="60"/>
+              <w:right w:type="dxa" w:w="100"/>
+            </w:tcMar>
+          </w:tcPr>
+          <w:p>
+            <w:r>
+              <w:rPr>
+                <w:rFonts w:ascii="Calibri" w:cs="Calibri" w:eastAsia="Calibri" w:hAnsi="Calibri"/>
+                <w:b w:val="false"/>
+                <w:bCs w:val="false"/>
+                <w:color w:val="000000"/>
+                <w:sz w:val="18"/>
+                <w:szCs w:val="18"/>
+              </w:rPr>
+              <w:t xml:space="preserve">Revenue per employee, large firms</w:t>
+            </w:r>
+          </w:p>
+        </w:tc>
+        <w:tc>
+          <w:tcPr>
+            <w:tcW w:type="dxa" w:w="1750"/>
+            <w:tcBorders>
+              <w:top w:val="single" w:color="BFBFBF" w:sz="4"/>
+              <w:left w:val="single" w:color="BFBFBF" w:sz="4"/>
+              <w:bottom w:val="single" w:color="BFBFBF" w:sz="4"/>
+              <w:right w:val="single" w:color="BFBFBF" w:sz="4"/>
+            </w:tcBorders>
+            <w:tcMar>
+              <w:top w:type="dxa" w:w="60"/>
+              <w:left w:type="dxa" w:w="100"/>
+              <w:bottom w:type="dxa" w:w="60"/>
+              <w:right w:type="dxa" w:w="100"/>
+            </w:tcMar>
+          </w:tcPr>
+          <w:p>
+            <w:r>
+              <w:rPr>
+                <w:rFonts w:ascii="Calibri" w:cs="Calibri" w:eastAsia="Calibri" w:hAnsi="Calibri"/>
+                <w:b w:val="false"/>
+                <w:bCs w:val="false"/>
+                <w:color w:val="000000"/>
+                <w:sz w:val="18"/>
+                <w:szCs w:val="18"/>
+              </w:rPr>
+              <w:t xml:space="preserve">SEK 3.1-3.9m</w:t>
+            </w:r>
+          </w:p>
+        </w:tc>
+        <w:tc>
+          <w:tcPr>
+            <w:tcW w:type="dxa" w:w="1750"/>
+            <w:tcBorders>
+              <w:top w:val="single" w:color="BFBFBF" w:sz="4"/>
+              <w:left w:val="single" w:color="BFBFBF" w:sz="4"/>
+              <w:bottom w:val="single" w:color="BFBFBF" w:sz="4"/>
+              <w:right w:val="single" w:color="BFBFBF" w:sz="4"/>
+            </w:tcBorders>
+            <w:tcMar>
+              <w:top w:type="dxa" w:w="60"/>
+              <w:left w:type="dxa" w:w="100"/>
+              <w:bottom w:type="dxa" w:w="60"/>
+              <w:right w:type="dxa" w:w="100"/>
+            </w:tcMar>
+          </w:tcPr>
+          <w:p>
+            <w:r>
+              <w:rPr>
+                <w:rFonts w:ascii="Calibri" w:cs="Calibri" w:eastAsia="Calibri" w:hAnsi="Calibri"/>
+                <w:b w:val="false"/>
+                <w:bCs w:val="false"/>
+                <w:color w:val="000000"/>
+                <w:sz w:val="18"/>
+                <w:szCs w:val="18"/>
+              </w:rPr>
+              <w:t xml:space="preserve">NOK 4.7-5.5m (SEK 4.9-5.8m)</w:t>
+            </w:r>
+          </w:p>
+        </w:tc>
+        <w:tc>
+          <w:tcPr>
+            <w:tcW w:type="dxa" w:w="1750"/>
+            <w:tcBorders>
+              <w:top w:val="single" w:color="BFBFBF" w:sz="4"/>
+              <w:left w:val="single" w:color="BFBFBF" w:sz="4"/>
+              <w:bottom w:val="single" w:color="BFBFBF" w:sz="4"/>
+              <w:right w:val="single" w:color="BFBFBF" w:sz="4"/>
+            </w:tcBorders>
+            <w:tcMar>
+              <w:top w:type="dxa" w:w="60"/>
+              <w:left w:type="dxa" w:w="100"/>
+              <w:bottom w:type="dxa" w:w="60"/>
+              <w:right w:type="dxa" w:w="100"/>
+            </w:tcMar>
+          </w:tcPr>
+          <w:p>
+            <w:r>
+              <w:rPr>
+                <w:rFonts w:ascii="Calibri" w:cs="Calibri" w:eastAsia="Calibri" w:hAnsi="Calibri"/>
+                <w:b w:val="false"/>
+                <w:bCs w:val="false"/>
+                <w:color w:val="000000"/>
+                <w:sz w:val="18"/>
+                <w:szCs w:val="18"/>
+              </w:rPr>
+              <w:t xml:space="preserve">DKK 2.4-2.55m (SEK 3.6-3.8m)</w:t>
+            </w:r>
+          </w:p>
+        </w:tc>
+        <w:tc>
+          <w:tcPr>
+            <w:tcW w:type="dxa" w:w="1776"/>
+            <w:tcBorders>
+              <w:top w:val="single" w:color="BFBFBF" w:sz="4"/>
+              <w:left w:val="single" w:color="BFBFBF" w:sz="4"/>
+              <w:bottom w:val="single" w:color="BFBFBF" w:sz="4"/>
+              <w:right w:val="single" w:color="BFBFBF" w:sz="4"/>
+            </w:tcBorders>
+            <w:tcMar>
+              <w:top w:type="dxa" w:w="60"/>
+              <w:left w:type="dxa" w:w="100"/>
+              <w:bottom w:type="dxa" w:w="60"/>
+              <w:right w:type="dxa" w:w="100"/>
+            </w:tcMar>
+          </w:tcPr>
+          <w:p>
+            <w:r>
+              <w:rPr>
+                <w:rFonts w:ascii="Calibri" w:cs="Calibri" w:eastAsia="Calibri" w:hAnsi="Calibri"/>
+                <w:b w:val="false"/>
+                <w:bCs w:val="false"/>
+                <w:color w:val="000000"/>
+                <w:sz w:val="18"/>
+                <w:szCs w:val="18"/>
+              </w:rPr>
+              <w:t xml:space="preserve">EUR 205-384k (SEK 2.3-4.3m)</w:t>
+            </w:r>
+          </w:p>
+        </w:tc>
+      </w:tr>
+      <w:tr>
+        <w:tc>
+          <w:tcPr>
+            <w:tcW w:type="dxa" w:w="2000"/>
+            <w:tcBorders>
+              <w:top w:val="single" w:color="BFBFBF" w:sz="4"/>
+              <w:left w:val="single" w:color="BFBFBF" w:sz="4"/>
+              <w:bottom w:val="single" w:color="BFBFBF" w:sz="4"/>
+              <w:right w:val="single" w:color="BFBFBF" w:sz="4"/>
+            </w:tcBorders>
+            <w:tcMar>
+              <w:top w:type="dxa" w:w="60"/>
+              <w:left w:type="dxa" w:w="100"/>
+              <w:bottom w:type="dxa" w:w="60"/>
+              <w:right w:type="dxa" w:w="100"/>
+            </w:tcMar>
+          </w:tcPr>
+          <w:p>
+            <w:r>
+              <w:rPr>
+                <w:rFonts w:ascii="Calibri" w:cs="Calibri" w:eastAsia="Calibri" w:hAnsi="Calibri"/>
+                <w:b w:val="false"/>
+                <w:bCs w:val="false"/>
+                <w:color w:val="000000"/>
+                <w:sz w:val="18"/>
+                <w:szCs w:val="18"/>
+              </w:rPr>
+              <w:t xml:space="preserve">External / PE ownership</w:t>
+            </w:r>
+          </w:p>
+        </w:tc>
+        <w:tc>
+          <w:tcPr>
+            <w:tcW w:type="dxa" w:w="1750"/>
+            <w:tcBorders>
+              <w:top w:val="single" w:color="BFBFBF" w:sz="4"/>
+              <w:left w:val="single" w:color="BFBFBF" w:sz="4"/>
+              <w:bottom w:val="single" w:color="BFBFBF" w:sz="4"/>
+              <w:right w:val="single" w:color="BFBFBF" w:sz="4"/>
+            </w:tcBorders>
+            <w:tcMar>
+              <w:top w:type="dxa" w:w="60"/>
+              <w:left w:type="dxa" w:w="100"/>
+              <w:bottom w:type="dxa" w:w="60"/>
+              <w:right w:type="dxa" w:w="100"/>
+            </w:tcMar>
+          </w:tcPr>
+          <w:p>
+            <w:r>
+              <w:rPr>
+                <w:rFonts w:ascii="Calibri" w:cs="Calibri" w:eastAsia="Calibri" w:hAnsi="Calibri"/>
+                <w:b w:val="false"/>
+                <w:bCs w:val="false"/>
+                <w:color w:val="000000"/>
+                <w:sz w:val="18"/>
+                <w:szCs w:val="18"/>
+              </w:rPr>
+              <w:t xml:space="preserve">Only by leaving the Bar (AGRD precedent)</w:t>
+            </w:r>
+          </w:p>
+        </w:tc>
+        <w:tc>
+          <w:tcPr>
+            <w:tcW w:type="dxa" w:w="1750"/>
+            <w:tcBorders>
+              <w:top w:val="single" w:color="BFBFBF" w:sz="4"/>
+              <w:left w:val="single" w:color="BFBFBF" w:sz="4"/>
+              <w:bottom w:val="single" w:color="BFBFBF" w:sz="4"/>
+              <w:right w:val="single" w:color="BFBFBF" w:sz="4"/>
+            </w:tcBorders>
+            <w:tcMar>
+              <w:top w:type="dxa" w:w="60"/>
+              <w:left w:type="dxa" w:w="100"/>
+              <w:bottom w:type="dxa" w:w="60"/>
+              <w:right w:type="dxa" w:w="100"/>
+            </w:tcMar>
+          </w:tcPr>
+          <w:p>
+            <w:r>
+              <w:rPr>
+                <w:rFonts w:ascii="Calibri" w:cs="Calibri" w:eastAsia="Calibri" w:hAnsi="Calibri"/>
+                <w:b w:val="false"/>
+                <w:bCs w:val="false"/>
+                <w:color w:val="000000"/>
+                <w:sz w:val="18"/>
+                <w:szCs w:val="18"/>
+              </w:rPr>
+              <w:t xml:space="preserve">Lawyers Act 2025: no passive ownership of advokat firms</w:t>
+            </w:r>
+          </w:p>
+        </w:tc>
+        <w:tc>
+          <w:tcPr>
+            <w:tcW w:type="dxa" w:w="1750"/>
+            <w:tcBorders>
+              <w:top w:val="single" w:color="BFBFBF" w:sz="4"/>
+              <w:left w:val="single" w:color="BFBFBF" w:sz="4"/>
+              <w:bottom w:val="single" w:color="BFBFBF" w:sz="4"/>
+              <w:right w:val="single" w:color="BFBFBF" w:sz="4"/>
+            </w:tcBorders>
+            <w:tcMar>
+              <w:top w:type="dxa" w:w="60"/>
+              <w:left w:type="dxa" w:w="100"/>
+              <w:bottom w:type="dxa" w:w="60"/>
+              <w:right w:type="dxa" w:w="100"/>
+            </w:tcMar>
+          </w:tcPr>
+          <w:p>
+            <w:r>
+              <w:rPr>
+                <w:rFonts w:ascii="Calibri" w:cs="Calibri" w:eastAsia="Calibri" w:hAnsi="Calibri"/>
+                <w:b w:val="false"/>
+                <w:bCs w:val="false"/>
+                <w:color w:val="000000"/>
+                <w:sz w:val="18"/>
+                <w:szCs w:val="18"/>
+              </w:rPr>
+              <w:t xml:space="preserve">Lawyer-only ownership; advocates' court monopoly</w:t>
+            </w:r>
+          </w:p>
+        </w:tc>
+        <w:tc>
+          <w:tcPr>
+            <w:tcW w:type="dxa" w:w="1776"/>
+            <w:tcBorders>
+              <w:top w:val="single" w:color="BFBFBF" w:sz="4"/>
+              <w:left w:val="single" w:color="BFBFBF" w:sz="4"/>
+              <w:bottom w:val="single" w:color="BFBFBF" w:sz="4"/>
+              <w:right w:val="single" w:color="BFBFBF" w:sz="4"/>
+            </w:tcBorders>
+            <w:tcMar>
+              <w:top w:type="dxa" w:w="60"/>
+              <w:left w:type="dxa" w:w="100"/>
+              <w:bottom w:type="dxa" w:w="60"/>
+              <w:right w:type="dxa" w:w="100"/>
+            </w:tcMar>
+          </w:tcPr>
+          <w:p>
+            <w:r>
+              <w:rPr>
+                <w:rFonts w:ascii="Calibri" w:cs="Calibri" w:eastAsia="Calibri" w:hAnsi="Calibri"/>
+                <w:b w:val="false"/>
+                <w:bCs w:val="false"/>
+                <w:color w:val="000000"/>
+                <w:sz w:val="18"/>
+                <w:szCs w:val="18"/>
+              </w:rPr>
+              <w:t xml:space="preserve">Bar firms lawyer-owned; licensed-counsel route; Fondia listed</w:t>
+            </w:r>
+          </w:p>
+        </w:tc>
+      </w:tr>
+    </w:tbl>
+    <w:p>
+      <w:pPr>
+        <w:spacing w:after="120"/>
+      </w:pPr>
+      <w:r>
+        <w:rPr>
+          <w:rFonts w:ascii="Calibri" w:cs="Calibri" w:eastAsia="Calibri" w:hAnsi="Calibri"/>
+          <w:sz w:val="21"/>
+          <w:szCs w:val="21"/>
+        </w:rPr>
+        <w:t xml:space="preserve"/>
+      </w:r>
+    </w:p>
+    <w:p>
+      <w:pPr>
+        <w:spacing w:after="120"/>
+      </w:pPr>
+      <w:r>
+        <w:rPr>
+          <w:rFonts w:ascii="Calibri" w:cs="Calibri" w:eastAsia="Calibri" w:hAnsi="Calibri"/>
+          <w:b/>
+          <w:bCs/>
+          <w:sz w:val="21"/>
+          <w:szCs w:val="21"/>
+        </w:rPr>
+        <w:t xml:space="preserve">Nordic total: </w:t>
+      </w:r>
+      <w:r>
+        <w:rPr>
+          <w:rFonts w:ascii="Calibri" w:cs="Calibri" w:eastAsia="Calibri" w:hAnsi="Calibri"/>
+          <w:sz w:val="21"/>
+          <w:szCs w:val="21"/>
+        </w:rPr>
+        <w:t xml:space="preserve">legal activities ~SEK 110bn (2024; Eurostat basis ~SEK 107bn); business law ~SEK 59-68bn, with Sweden the largest business-law market (~30-35%), followed by Denmark, Norway and Finland.</w:t>
+      </w:r>
+    </w:p>
+    <w:p>
+      <w:pPr>
+        <w:pStyle w:val="ListParagraph"/>
+        <w:numPr>
+          <w:ilvl w:val="0"/>
+          <w:numId w:val="2"/>
+        </w:numPr>
+        <w:spacing w:after="80"/>
+      </w:pPr>
+      <w:r>
+        <w:rPr>
+          <w:rFonts w:ascii="Calibri" w:cs="Calibri" w:eastAsia="Calibri" w:hAnsi="Calibri"/>
+          <w:b/>
+          <w:bCs/>
+          <w:sz w:val="21"/>
+          <w:szCs w:val="21"/>
+        </w:rPr>
+        <w:t xml:space="preserve">Norway </w:t>
+      </w:r>
+      <w:r>
+        <w:rPr>
+          <w:rFonts w:ascii="Calibri" w:cs="Calibri" w:eastAsia="Calibri" w:hAnsi="Calibri"/>
+          <w:sz w:val="21"/>
+          <w:szCs w:val="21"/>
+        </w:rPr>
+        <w:t xml:space="preserve">is the most profitable per head (EUR 255k turnover per employee) and fastest growing, with strong Norwegian firms expanding into Sweden and Denmark (Schjødt, BAHR).</w:t>
+      </w:r>
+    </w:p>
+    <w:p>
+      <w:pPr>
+        <w:pStyle w:val="ListParagraph"/>
+        <w:numPr>
+          <w:ilvl w:val="0"/>
+          <w:numId w:val="2"/>
+        </w:numPr>
+        <w:spacing w:after="80"/>
+      </w:pPr>
+      <w:r>
+        <w:rPr>
+          <w:rFonts w:ascii="Calibri" w:cs="Calibri" w:eastAsia="Calibri" w:hAnsi="Calibri"/>
+          <w:b/>
+          <w:bCs/>
+          <w:sz w:val="21"/>
+          <w:szCs w:val="21"/>
+        </w:rPr>
+        <w:t xml:space="preserve">Denmark </w:t>
+      </w:r>
+      <w:r>
+        <w:rPr>
+          <w:rFonts w:ascii="Calibri" w:cs="Calibri" w:eastAsia="Calibri" w:hAnsi="Calibri"/>
+          <w:sz w:val="21"/>
+          <w:szCs w:val="21"/>
+        </w:rPr>
+        <w:t xml:space="preserve">is the most concentrated market among the large firms and has the strictest framework (lawyer-only ownership and a court-representation monopoly).</w:t>
+      </w:r>
+    </w:p>
+    <w:p>
+      <w:pPr>
+        <w:pStyle w:val="ListParagraph"/>
+        <w:numPr>
+          <w:ilvl w:val="0"/>
+          <w:numId w:val="2"/>
+        </w:numPr>
+        <w:spacing w:after="80"/>
+      </w:pPr>
+      <w:r>
+        <w:rPr>
+          <w:rFonts w:ascii="Calibri" w:cs="Calibri" w:eastAsia="Calibri" w:hAnsi="Calibri"/>
+          <w:b/>
+          <w:bCs/>
+          <w:sz w:val="21"/>
+          <w:szCs w:val="21"/>
+        </w:rPr>
+        <w:t xml:space="preserve">Finland </w:t>
+      </w:r>
+      <w:r>
+        <w:rPr>
+          <w:rFonts w:ascii="Calibri" w:cs="Calibri" w:eastAsia="Calibri" w:hAnsi="Calibri"/>
+          <w:sz w:val="21"/>
+          <w:szCs w:val="21"/>
+        </w:rPr>
+        <w:t xml:space="preserve">is the smallest, with a very profitable top tier (EBIT margins ~37-54% at Roschier, Krogerus, Avance, Borenius) and a fragmented mid-tier of firms of EUR 6-38m revenue.</w:t>
+      </w:r>
+    </w:p>
+    <w:p>
+      <w:pPr>
+        <w:pStyle w:val="ListParagraph"/>
+        <w:numPr>
+          <w:ilvl w:val="0"/>
+          <w:numId w:val="2"/>
+        </w:numPr>
+        <w:spacing w:after="80"/>
+      </w:pPr>
+      <w:r>
+        <w:rPr>
+          <w:rFonts w:ascii="Calibri" w:cs="Calibri" w:eastAsia="Calibri" w:hAnsi="Calibri"/>
+          <w:b/>
+          <w:bCs/>
+          <w:sz w:val="21"/>
+          <w:szCs w:val="21"/>
+        </w:rPr>
+        <w:t xml:space="preserve">Sweden </w:t>
+      </w:r>
+      <w:r>
+        <w:rPr>
+          <w:rFonts w:ascii="Calibri" w:cs="Calibri" w:eastAsia="Calibri" w:hAnsi="Calibri"/>
+          <w:sz w:val="21"/>
+          <w:szCs w:val="21"/>
+        </w:rPr>
+        <w:t xml:space="preserve">is the largest and most fragmented business-law market, and the only one with an established PE roll-up (AGRD).</w:t>
+      </w:r>
+    </w:p>
+    <w:p>
+      <w:pPr>
+        <w:pStyle w:val="Heading1"/>
+        <w:spacing w:after="120" w:before="280"/>
+      </w:pPr>
+      <w:r>
+        <w:rPr>
+          <w:rFonts w:ascii="Calibri" w:cs="Calibri" w:eastAsia="Calibri" w:hAnsi="Calibri"/>
+          <w:b/>
+          <w:bCs/>
+          <w:color w:val="1F3864"/>
+          <w:sz w:val="28"/>
+          <w:szCs w:val="28"/>
+        </w:rPr>
+        <w:t xml:space="preserve">3. Guide to the data book</w:t>
       </w:r>
     </w:p>
     <w:tbl>
@@ -2666,6 +4786,68 @@
                 <w:szCs w:val="18"/>
               </w:rPr>
               <w:t xml:space="preserve">Headline estimates and SCB official statistics (above).</w:t>
+            </w:r>
+          </w:p>
+        </w:tc>
+      </w:tr>
+      <w:tr>
+        <w:tc>
+          <w:tcPr>
+            <w:tcW w:type="dxa" w:w="2400"/>
+            <w:tcBorders>
+              <w:top w:val="single" w:color="BFBFBF" w:sz="4"/>
+              <w:left w:val="single" w:color="BFBFBF" w:sz="4"/>
+              <w:bottom w:val="single" w:color="BFBFBF" w:sz="4"/>
+              <w:right w:val="single" w:color="BFBFBF" w:sz="4"/>
+            </w:tcBorders>
+            <w:tcMar>
+              <w:top w:type="dxa" w:w="60"/>
+              <w:left w:type="dxa" w:w="100"/>
+              <w:bottom w:type="dxa" w:w="60"/>
+              <w:right w:type="dxa" w:w="100"/>
+            </w:tcMar>
+          </w:tcPr>
+          <w:p>
+            <w:r>
+              <w:rPr>
+                <w:rFonts w:ascii="Calibri" w:cs="Calibri" w:eastAsia="Calibri" w:hAnsi="Calibri"/>
+                <w:b w:val="false"/>
+                <w:bCs w:val="false"/>
+                <w:color w:val="000000"/>
+                <w:sz w:val="18"/>
+                <w:szCs w:val="18"/>
+              </w:rPr>
+              <w:t xml:space="preserve">A. Nordic market</w:t>
+            </w:r>
+          </w:p>
+        </w:tc>
+        <w:tc>
+          <w:tcPr>
+            <w:tcW w:type="dxa" w:w="6626"/>
+            <w:tcBorders>
+              <w:top w:val="single" w:color="BFBFBF" w:sz="4"/>
+              <w:left w:val="single" w:color="BFBFBF" w:sz="4"/>
+              <w:bottom w:val="single" w:color="BFBFBF" w:sz="4"/>
+              <w:right w:val="single" w:color="BFBFBF" w:sz="4"/>
+            </w:tcBorders>
+            <w:tcMar>
+              <w:top w:type="dxa" w:w="60"/>
+              <w:left w:type="dxa" w:w="100"/>
+              <w:bottom w:type="dxa" w:w="60"/>
+              <w:right w:type="dxa" w:w="100"/>
+            </w:tcMar>
+          </w:tcPr>
+          <w:p>
+            <w:r>
+              <w:rPr>
+                <w:rFonts w:ascii="Calibri" w:cs="Calibri" w:eastAsia="Calibri" w:hAnsi="Calibri"/>
+                <w:b w:val="false"/>
+                <w:bCs w:val="false"/>
+                <w:color w:val="000000"/>
+                <w:sz w:val="18"/>
+                <w:szCs w:val="18"/>
+              </w:rPr>
+              <w:t xml:space="preserve">FX (Riksbank) and Sweden / Norway / Denmark / Finland comparison: official statistics, business-law estimates, structure, leading firms, ownership rules, consolidation.</w:t>
             </w:r>
           </w:p>
         </w:tc>
@@ -3331,7 +5513,7 @@
           <w:sz w:val="28"/>
           <w:szCs w:val="28"/>
         </w:rPr>
-        <w:t xml:space="preserve">3. Key caveats</w:t>
+        <w:t xml:space="preserve">4. Key caveats</w:t>
       </w:r>
     </w:p>
     <w:p>
@@ -3472,6 +5654,34 @@
           <w:szCs w:val="21"/>
         </w:rPr>
         <w:t xml:space="preserve">Affärsvärlden's full FY2025 table and Dagens Juridik's 2025 tables are paywalled; limited partnerships (KB) file no public accounts.</w:t>
+      </w:r>
+    </w:p>
+    <w:p>
+      <w:pPr>
+        <w:pStyle w:val="ListParagraph"/>
+        <w:numPr>
+          <w:ilvl w:val="0"/>
+          <w:numId w:val="2"/>
+        </w:numPr>
+        <w:spacing w:after="80"/>
+      </w:pPr>
+      <w:r>
+        <w:rPr>
+          <w:rFonts w:ascii="Calibri" w:cs="Calibri" w:eastAsia="Calibri" w:hAnsi="Calibri"/>
+          <w:b/>
+          <w:bCs/>
+          <w:sz w:val="21"/>
+          <w:szCs w:val="21"/>
+        </w:rPr>
+        <w:t xml:space="preserve">Nordic comparability: </w:t>
+      </w:r>
+      <w:r>
+        <w:rPr>
+          <w:rFonts w:ascii="Calibri" w:cs="Calibri" w:eastAsia="Calibri" w:hAnsi="Calibri"/>
+          <w:sz w:val="21"/>
+          <w:szCs w:val="21"/>
+        </w:rPr>
+        <w:t xml:space="preserve">official statistics measure all legal activities; firm revenues use different fiscal years and entity scopes; Denmark and Finland business-law figures are estimates.</w:t>
       </w:r>
     </w:p>
     <w:sectPr>

</xml_diff>

<commit_message>
Market size summary: add Nordic consolidation and international activity section
Co-Authored-By: Claude Opus 5.5 <noreply@anthropic.com>
Claude-Session: https://claude.ai/code/session_01Tu61bPEQej1E6sErbEFanY
</commit_message>
<xml_diff>
--- a/research/swedish_legal_market_size_summary.docx
+++ b/research/swedish_legal_market_size_summary.docx
@@ -4626,6 +4626,503 @@
           <w:szCs w:val="21"/>
         </w:rPr>
         <w:t xml:space="preserve">is the largest and most fragmented business-law market, and the only one with an established PE roll-up (AGRD).</w:t>
+      </w:r>
+    </w:p>
+    <w:p>
+      <w:pPr>
+        <w:pStyle w:val="Heading2"/>
+        <w:spacing w:after="80" w:before="200"/>
+      </w:pPr>
+      <w:r>
+        <w:rPr>
+          <w:rFonts w:ascii="Calibri" w:cs="Calibri" w:eastAsia="Calibri" w:hAnsi="Calibri"/>
+          <w:b/>
+          <w:bCs/>
+          <w:color w:val="1F3864"/>
+          <w:sz w:val="23"/>
+          <w:szCs w:val="23"/>
+        </w:rPr>
+        <w:t xml:space="preserve">Consolidation and international activity, 2020-2026</w:t>
+      </w:r>
+    </w:p>
+    <w:tbl>
+      <w:tblPr>
+        <w:tblW w:type="dxa" w:w="9026"/>
+        <w:tblBorders>
+          <w:top w:val="single" w:color="auto" w:sz="4"/>
+          <w:left w:val="single" w:color="auto" w:sz="4"/>
+          <w:bottom w:val="single" w:color="auto" w:sz="4"/>
+          <w:right w:val="single" w:color="auto" w:sz="4"/>
+          <w:insideH w:val="single" w:color="auto" w:sz="4"/>
+          <w:insideV w:val="single" w:color="auto" w:sz="4"/>
+        </w:tblBorders>
+      </w:tblPr>
+      <w:tblGrid>
+        <w:gridCol w:w="1300"/>
+        <w:gridCol w:w="7726"/>
+      </w:tblGrid>
+      <w:tr>
+        <w:trPr>
+          <w:tblHeader/>
+        </w:trPr>
+        <w:tc>
+          <w:tcPr>
+            <w:tcW w:type="dxa" w:w="1300"/>
+            <w:tcBorders>
+              <w:top w:val="single" w:color="BFBFBF" w:sz="4"/>
+              <w:left w:val="single" w:color="BFBFBF" w:sz="4"/>
+              <w:bottom w:val="single" w:color="BFBFBF" w:sz="4"/>
+              <w:right w:val="single" w:color="BFBFBF" w:sz="4"/>
+            </w:tcBorders>
+            <w:shd w:fill="1F3864" w:color="auto" w:val="clear"/>
+            <w:tcMar>
+              <w:top w:type="dxa" w:w="60"/>
+              <w:left w:type="dxa" w:w="100"/>
+              <w:bottom w:type="dxa" w:w="60"/>
+              <w:right w:type="dxa" w:w="100"/>
+            </w:tcMar>
+          </w:tcPr>
+          <w:p>
+            <w:r>
+              <w:rPr>
+                <w:rFonts w:ascii="Calibri" w:cs="Calibri" w:eastAsia="Calibri" w:hAnsi="Calibri"/>
+                <w:b/>
+                <w:bCs/>
+                <w:color w:val="FFFFFF"/>
+                <w:sz w:val="18"/>
+                <w:szCs w:val="18"/>
+              </w:rPr>
+              <w:t xml:space="preserve">Country</w:t>
+            </w:r>
+          </w:p>
+        </w:tc>
+        <w:tc>
+          <w:tcPr>
+            <w:tcW w:type="dxa" w:w="7726"/>
+            <w:tcBorders>
+              <w:top w:val="single" w:color="BFBFBF" w:sz="4"/>
+              <w:left w:val="single" w:color="BFBFBF" w:sz="4"/>
+              <w:bottom w:val="single" w:color="BFBFBF" w:sz="4"/>
+              <w:right w:val="single" w:color="BFBFBF" w:sz="4"/>
+            </w:tcBorders>
+            <w:shd w:fill="1F3864" w:color="auto" w:val="clear"/>
+            <w:tcMar>
+              <w:top w:type="dxa" w:w="60"/>
+              <w:left w:type="dxa" w:w="100"/>
+              <w:bottom w:type="dxa" w:w="60"/>
+              <w:right w:type="dxa" w:w="100"/>
+            </w:tcMar>
+          </w:tcPr>
+          <w:p>
+            <w:r>
+              <w:rPr>
+                <w:rFonts w:ascii="Calibri" w:cs="Calibri" w:eastAsia="Calibri" w:hAnsi="Calibri"/>
+                <w:b/>
+                <w:bCs/>
+                <w:color w:val="FFFFFF"/>
+                <w:sz w:val="18"/>
+                <w:szCs w:val="18"/>
+              </w:rPr>
+              <w:t xml:space="preserve">Activity</w:t>
+            </w:r>
+          </w:p>
+        </w:tc>
+      </w:tr>
+      <w:tr>
+        <w:tc>
+          <w:tcPr>
+            <w:tcW w:type="dxa" w:w="1300"/>
+            <w:tcBorders>
+              <w:top w:val="single" w:color="BFBFBF" w:sz="4"/>
+              <w:left w:val="single" w:color="BFBFBF" w:sz="4"/>
+              <w:bottom w:val="single" w:color="BFBFBF" w:sz="4"/>
+              <w:right w:val="single" w:color="BFBFBF" w:sz="4"/>
+            </w:tcBorders>
+            <w:tcMar>
+              <w:top w:type="dxa" w:w="60"/>
+              <w:left w:type="dxa" w:w="100"/>
+              <w:bottom w:type="dxa" w:w="60"/>
+              <w:right w:type="dxa" w:w="100"/>
+            </w:tcMar>
+          </w:tcPr>
+          <w:p>
+            <w:r>
+              <w:rPr>
+                <w:rFonts w:ascii="Calibri" w:cs="Calibri" w:eastAsia="Calibri" w:hAnsi="Calibri"/>
+                <w:b w:val="false"/>
+                <w:bCs w:val="false"/>
+                <w:color w:val="000000"/>
+                <w:sz w:val="18"/>
+                <w:szCs w:val="18"/>
+              </w:rPr>
+              <w:t xml:space="preserve">Sweden</w:t>
+            </w:r>
+          </w:p>
+        </w:tc>
+        <w:tc>
+          <w:tcPr>
+            <w:tcW w:type="dxa" w:w="7726"/>
+            <w:tcBorders>
+              <w:top w:val="single" w:color="BFBFBF" w:sz="4"/>
+              <w:left w:val="single" w:color="BFBFBF" w:sz="4"/>
+              <w:bottom w:val="single" w:color="BFBFBF" w:sz="4"/>
+              <w:right w:val="single" w:color="BFBFBF" w:sz="4"/>
+            </w:tcBorders>
+            <w:tcMar>
+              <w:top w:type="dxa" w:w="60"/>
+              <w:left w:type="dxa" w:w="100"/>
+              <w:bottom w:type="dxa" w:w="60"/>
+              <w:right w:type="dxa" w:w="100"/>
+            </w:tcMar>
+          </w:tcPr>
+          <w:p>
+            <w:r>
+              <w:rPr>
+                <w:rFonts w:ascii="Calibri" w:cs="Calibri" w:eastAsia="Calibri" w:hAnsi="Calibri"/>
+                <w:b w:val="false"/>
+                <w:bCs w:val="false"/>
+                <w:color w:val="000000"/>
+                <w:sz w:val="18"/>
+                <w:szCs w:val="18"/>
+              </w:rPr>
+              <w:t xml:space="preserve">AGRD (Axcel) PE roll-up of 9+ firms since Aug-2025 (Allié, Born, Morris Law, Next, Synch, TM &amp; Partners; then Wigge, Bokwall Rislund, Moll Wendén, Setterwalls Malmö as Ascente Law; Synch-Qap Legal); CMS-Wistrand (2024); BAHR Stockholm (2026); Schjødt-Hamilton (2020); Magnusson-Gro and Walthon Ramberg (2026); splits: Hannes Snellman (2024), MAQS (2027), Glimstedt Stockholm/Göteborg (2021)</w:t>
+            </w:r>
+          </w:p>
+        </w:tc>
+      </w:tr>
+      <w:tr>
+        <w:tc>
+          <w:tcPr>
+            <w:tcW w:type="dxa" w:w="1300"/>
+            <w:tcBorders>
+              <w:top w:val="single" w:color="BFBFBF" w:sz="4"/>
+              <w:left w:val="single" w:color="BFBFBF" w:sz="4"/>
+              <w:bottom w:val="single" w:color="BFBFBF" w:sz="4"/>
+              <w:right w:val="single" w:color="BFBFBF" w:sz="4"/>
+            </w:tcBorders>
+            <w:tcMar>
+              <w:top w:type="dxa" w:w="60"/>
+              <w:left w:type="dxa" w:w="100"/>
+              <w:bottom w:type="dxa" w:w="60"/>
+              <w:right w:type="dxa" w:w="100"/>
+            </w:tcMar>
+          </w:tcPr>
+          <w:p>
+            <w:r>
+              <w:rPr>
+                <w:rFonts w:ascii="Calibri" w:cs="Calibri" w:eastAsia="Calibri" w:hAnsi="Calibri"/>
+                <w:b w:val="false"/>
+                <w:bCs w:val="false"/>
+                <w:color w:val="000000"/>
+                <w:sz w:val="18"/>
+                <w:szCs w:val="18"/>
+              </w:rPr>
+              <w:t xml:space="preserve">Norway</w:t>
+            </w:r>
+          </w:p>
+        </w:tc>
+        <w:tc>
+          <w:tcPr>
+            <w:tcW w:type="dxa" w:w="7726"/>
+            <w:tcBorders>
+              <w:top w:val="single" w:color="BFBFBF" w:sz="4"/>
+              <w:left w:val="single" w:color="BFBFBF" w:sz="4"/>
+              <w:bottom w:val="single" w:color="BFBFBF" w:sz="4"/>
+              <w:right w:val="single" w:color="BFBFBF" w:sz="4"/>
+            </w:tcBorders>
+            <w:tcMar>
+              <w:top w:type="dxa" w:w="60"/>
+              <w:left w:type="dxa" w:w="100"/>
+              <w:bottom w:type="dxa" w:w="60"/>
+              <w:right w:type="dxa" w:w="100"/>
+            </w:tcMar>
+          </w:tcPr>
+          <w:p>
+            <w:r>
+              <w:rPr>
+                <w:rFonts w:ascii="Calibri" w:cs="Calibri" w:eastAsia="Calibri" w:hAnsi="Calibri"/>
+                <w:b w:val="false"/>
+                <w:bCs w:val="false"/>
+                <w:color w:val="000000"/>
+                <w:sz w:val="18"/>
+                <w:szCs w:val="18"/>
+              </w:rPr>
+              <w:t xml:space="preserve">Schjødt-Hamilton SE (2020), Copenhagen office (2022), Norrbom Vinding DK (Mar-2026); BAHR opens Stockholm and Copenhagen (2025-26) after hiring ~18 Schjødt partners; Ræder Bing (2023), Lippestad / Bache-Wiig and Tofte Hald (2024); Cedra buys Big-4 regional law offices (Dec-2025)</w:t>
+            </w:r>
+          </w:p>
+        </w:tc>
+      </w:tr>
+      <w:tr>
+        <w:tc>
+          <w:tcPr>
+            <w:tcW w:type="dxa" w:w="1300"/>
+            <w:tcBorders>
+              <w:top w:val="single" w:color="BFBFBF" w:sz="4"/>
+              <w:left w:val="single" w:color="BFBFBF" w:sz="4"/>
+              <w:bottom w:val="single" w:color="BFBFBF" w:sz="4"/>
+              <w:right w:val="single" w:color="BFBFBF" w:sz="4"/>
+            </w:tcBorders>
+            <w:tcMar>
+              <w:top w:type="dxa" w:w="60"/>
+              <w:left w:type="dxa" w:w="100"/>
+              <w:bottom w:type="dxa" w:w="60"/>
+              <w:right w:type="dxa" w:w="100"/>
+            </w:tcMar>
+          </w:tcPr>
+          <w:p>
+            <w:r>
+              <w:rPr>
+                <w:rFonts w:ascii="Calibri" w:cs="Calibri" w:eastAsia="Calibri" w:hAnsi="Calibri"/>
+                <w:b w:val="false"/>
+                <w:bCs w:val="false"/>
+                <w:color w:val="000000"/>
+                <w:sz w:val="18"/>
+                <w:szCs w:val="18"/>
+              </w:rPr>
+              <w:t xml:space="preserve">Denmark</w:t>
+            </w:r>
+          </w:p>
+        </w:tc>
+        <w:tc>
+          <w:tcPr>
+            <w:tcW w:type="dxa" w:w="7726"/>
+            <w:tcBorders>
+              <w:top w:val="single" w:color="BFBFBF" w:sz="4"/>
+              <w:left w:val="single" w:color="BFBFBF" w:sz="4"/>
+              <w:bottom w:val="single" w:color="BFBFBF" w:sz="4"/>
+              <w:right w:val="single" w:color="BFBFBF" w:sz="4"/>
+            </w:tcBorders>
+            <w:tcMar>
+              <w:top w:type="dxa" w:w="60"/>
+              <w:left w:type="dxa" w:w="100"/>
+              <w:bottom w:type="dxa" w:w="60"/>
+              <w:right w:type="dxa" w:w="100"/>
+            </w:tcMar>
+          </w:tcPr>
+          <w:p>
+            <w:r>
+              <w:rPr>
+                <w:rFonts w:ascii="Calibri" w:cs="Calibri" w:eastAsia="Calibri" w:hAnsi="Calibri"/>
+                <w:b w:val="false"/>
+                <w:bCs w:val="false"/>
+                <w:color w:val="000000"/>
+                <w:sz w:val="18"/>
+                <w:szCs w:val="18"/>
+              </w:rPr>
+              <w:t xml:space="preserve">HortenDahl merger (Jan-2026); DLA Piper takes 49 people from Lundgrens (Mar-2025); Schjødt-Norrbom Vinding (Mar-2026); Kromann Reumert converts to P/S (Nov-2025)</w:t>
+            </w:r>
+          </w:p>
+        </w:tc>
+      </w:tr>
+      <w:tr>
+        <w:tc>
+          <w:tcPr>
+            <w:tcW w:type="dxa" w:w="1300"/>
+            <w:tcBorders>
+              <w:top w:val="single" w:color="BFBFBF" w:sz="4"/>
+              <w:left w:val="single" w:color="BFBFBF" w:sz="4"/>
+              <w:bottom w:val="single" w:color="BFBFBF" w:sz="4"/>
+              <w:right w:val="single" w:color="BFBFBF" w:sz="4"/>
+            </w:tcBorders>
+            <w:tcMar>
+              <w:top w:type="dxa" w:w="60"/>
+              <w:left w:type="dxa" w:w="100"/>
+              <w:bottom w:type="dxa" w:w="60"/>
+              <w:right w:type="dxa" w:w="100"/>
+            </w:tcMar>
+          </w:tcPr>
+          <w:p>
+            <w:r>
+              <w:rPr>
+                <w:rFonts w:ascii="Calibri" w:cs="Calibri" w:eastAsia="Calibri" w:hAnsi="Calibri"/>
+                <w:b w:val="false"/>
+                <w:bCs w:val="false"/>
+                <w:color w:val="000000"/>
+                <w:sz w:val="18"/>
+                <w:szCs w:val="18"/>
+              </w:rPr>
+              <w:t xml:space="preserve">Finland</w:t>
+            </w:r>
+          </w:p>
+        </w:tc>
+        <w:tc>
+          <w:tcPr>
+            <w:tcW w:type="dxa" w:w="7726"/>
+            <w:tcBorders>
+              <w:top w:val="single" w:color="BFBFBF" w:sz="4"/>
+              <w:left w:val="single" w:color="BFBFBF" w:sz="4"/>
+              <w:bottom w:val="single" w:color="BFBFBF" w:sz="4"/>
+              <w:right w:val="single" w:color="BFBFBF" w:sz="4"/>
+            </w:tcBorders>
+            <w:tcMar>
+              <w:top w:type="dxa" w:w="60"/>
+              <w:left w:type="dxa" w:w="100"/>
+              <w:bottom w:type="dxa" w:w="60"/>
+              <w:right w:type="dxa" w:w="100"/>
+            </w:tcMar>
+          </w:tcPr>
+          <w:p>
+            <w:r>
+              <w:rPr>
+                <w:rFonts w:ascii="Calibri" w:cs="Calibri" w:eastAsia="Calibri" w:hAnsi="Calibri"/>
+                <w:b w:val="false"/>
+                <w:bCs w:val="false"/>
+                <w:color w:val="000000"/>
+                <w:sz w:val="18"/>
+                <w:szCs w:val="18"/>
+              </w:rPr>
+              <w:t xml:space="preserve">Hannes Snellman split into Finnish and Swedish firms (2024); DLA Piper-Project Law (2023); Merilampi-I&amp;O Partners (2025, single source); no PE investment found; Fondia (listed, non-Bar) shrinking</w:t>
+            </w:r>
+          </w:p>
+        </w:tc>
+      </w:tr>
+    </w:tbl>
+    <w:p>
+      <w:pPr>
+        <w:spacing w:after="120"/>
+      </w:pPr>
+      <w:r>
+        <w:rPr>
+          <w:rFonts w:ascii="Calibri" w:cs="Calibri" w:eastAsia="Calibri" w:hAnsi="Calibri"/>
+          <w:sz w:val="21"/>
+          <w:szCs w:val="21"/>
+        </w:rPr>
+        <w:t xml:space="preserve"/>
+      </w:r>
+    </w:p>
+    <w:p>
+      <w:pPr>
+        <w:spacing w:after="120"/>
+      </w:pPr>
+      <w:r>
+        <w:rPr>
+          <w:rFonts w:ascii="Calibri" w:cs="Calibri" w:eastAsia="Calibri" w:hAnsi="Calibri"/>
+          <w:b/>
+          <w:bCs/>
+          <w:sz w:val="21"/>
+          <w:szCs w:val="21"/>
+        </w:rPr>
+        <w:t xml:space="preserve">Swedish team lifts and partner moves (2+ partners): </w:t>
+      </w:r>
+      <w:r>
+        <w:rPr>
+          <w:rFonts w:ascii="Calibri" w:cs="Calibri" w:eastAsia="Calibri" w:hAnsi="Calibri"/>
+          <w:sz w:val="21"/>
+          <w:szCs w:val="21"/>
+        </w:rPr>
+        <w:t xml:space="preserve">Lindahl from Westermark Anjou (2 partners, 2020); MAQS from Delphi (3 M&amp;A partners, 2024); Gernandt &amp; Danielsson from Linklaters (2 partners + 5 associates, real estate, 2024); Cirio from AG Advokat (3 partners + 9, real estate/construction, 2025); BAHR from Schjødt Sweden (8 partners, 2025-26); Setterwalls Malmö to AGRD (12 partners, ~100 people, 2026).</w:t>
+      </w:r>
+    </w:p>
+    <w:p>
+      <w:pPr>
+        <w:pStyle w:val="ListParagraph"/>
+        <w:numPr>
+          <w:ilvl w:val="0"/>
+          <w:numId w:val="2"/>
+        </w:numPr>
+        <w:spacing w:after="80"/>
+      </w:pPr>
+      <w:r>
+        <w:rPr>
+          <w:rFonts w:ascii="Calibri" w:cs="Calibri" w:eastAsia="Calibri" w:hAnsi="Calibri"/>
+          <w:b/>
+          <w:bCs/>
+          <w:sz w:val="21"/>
+          <w:szCs w:val="21"/>
+        </w:rPr>
+        <w:t xml:space="preserve">PE consolidation: </w:t>
+      </w:r>
+      <w:r>
+        <w:rPr>
+          <w:rFonts w:ascii="Calibri" w:cs="Calibri" w:eastAsia="Calibri" w:hAnsi="Calibri"/>
+          <w:sz w:val="21"/>
+          <w:szCs w:val="21"/>
+        </w:rPr>
+        <w:t xml:space="preserve">Sweden is the only Nordic market with an established PE roll-up (AGRD: 11 firms in ~13 months); firms must leave the Bar. Norway and Denmark restrict external ownership; no PE deals found in Finland.</w:t>
+      </w:r>
+    </w:p>
+    <w:p>
+      <w:pPr>
+        <w:pStyle w:val="ListParagraph"/>
+        <w:numPr>
+          <w:ilvl w:val="0"/>
+          <w:numId w:val="2"/>
+        </w:numPr>
+        <w:spacing w:after="80"/>
+      </w:pPr>
+      <w:r>
+        <w:rPr>
+          <w:rFonts w:ascii="Calibri" w:cs="Calibri" w:eastAsia="Calibri" w:hAnsi="Calibri"/>
+          <w:b/>
+          <w:bCs/>
+          <w:sz w:val="21"/>
+          <w:szCs w:val="21"/>
+        </w:rPr>
+        <w:t xml:space="preserve">Cross-border: </w:t>
+      </w:r>
+      <w:r>
+        <w:rPr>
+          <w:rFonts w:ascii="Calibri" w:cs="Calibri" w:eastAsia="Calibri" w:hAnsi="Calibri"/>
+          <w:sz w:val="21"/>
+          <w:szCs w:val="21"/>
+        </w:rPr>
+        <w:t xml:space="preserve">Norwegian firms (Schjødt, BAHR) are building pan-Scandinavian platforms through mergers and team lifts; CMS and DLA Piper consolidate through network membership and team hires.</w:t>
+      </w:r>
+    </w:p>
+    <w:p>
+      <w:pPr>
+        <w:pStyle w:val="ListParagraph"/>
+        <w:numPr>
+          <w:ilvl w:val="0"/>
+          <w:numId w:val="2"/>
+        </w:numPr>
+        <w:spacing w:after="80"/>
+      </w:pPr>
+      <w:r>
+        <w:rPr>
+          <w:rFonts w:ascii="Calibri" w:cs="Calibri" w:eastAsia="Calibri" w:hAnsi="Calibri"/>
+          <w:b/>
+          <w:bCs/>
+          <w:sz w:val="21"/>
+          <w:szCs w:val="21"/>
+        </w:rPr>
+        <w:t xml:space="preserve">Net partner flows (Sweden, 2020-26): </w:t>
+      </w:r>
+      <w:r>
+        <w:rPr>
+          <w:rFonts w:ascii="Calibri" w:cs="Calibri" w:eastAsia="Calibri" w:hAnsi="Calibri"/>
+          <w:sz w:val="21"/>
+          <w:szCs w:val="21"/>
+        </w:rPr>
+        <w:t xml:space="preserve">largest net gainers BAHR (+10), MAQS (+5), Lindahl, Gernandt &amp; Danielsson and Cirio (+2 each); largest net losers Setterwalls (-13, Malmö exit), Schjødt (-7), Snellman (-4), Delphi and AG Advokat (-4 each).</w:t>
+      </w:r>
+    </w:p>
+    <w:p>
+      <w:pPr>
+        <w:pStyle w:val="ListParagraph"/>
+        <w:numPr>
+          <w:ilvl w:val="0"/>
+          <w:numId w:val="2"/>
+        </w:numPr>
+        <w:spacing w:after="80"/>
+      </w:pPr>
+      <w:r>
+        <w:rPr>
+          <w:rFonts w:ascii="Calibri" w:cs="Calibri" w:eastAsia="Calibri" w:hAnsi="Calibri"/>
+          <w:b/>
+          <w:bCs/>
+          <w:sz w:val="21"/>
+          <w:szCs w:val="21"/>
+        </w:rPr>
+        <w:t xml:space="preserve">Domestic mergers: </w:t>
+      </w:r>
+      <w:r>
+        <w:rPr>
+          <w:rFonts w:ascii="Calibri" w:cs="Calibri" w:eastAsia="Calibri" w:hAnsi="Calibri"/>
+          <w:sz w:val="21"/>
+          <w:szCs w:val="21"/>
+        </w:rPr>
+        <w:t xml:space="preserve">mostly small and mid-sized combinations (Ræder Bing, HortenDahl, Magnusson-Gro, Walthon Ramberg), consistent with scale pressure from technology costs and talent competition.</w:t>
       </w:r>
     </w:p>
     <w:p>

</xml_diff>